<commit_message>
docs: Entrega v2 con página inicial de cuentas, tarjetas y responsables + paso a paso por servicio (Meta, Gemini, OpenAI, Hetzner, Supabase, Vercel)
</commit_message>
<xml_diff>
--- a/docs/Entrega_DePaseoEnFincas.docx
+++ b/docs/Entrega_DePaseoEnFincas.docx
@@ -179,7 +179,7 @@
         <w:pStyle w:val="Heading1"/>
       </w:pPr>
       <w:r>
-        <w:t xml:space="preserve">1. Requisitos para operar en producción</w:t>
+        <w:t xml:space="preserve">1. Cuentas, tarjetas y responsables</w:t>
       </w:r>
     </w:p>
     <w:p>
@@ -193,7 +193,7 @@
           <w:sz w:val="22"/>
           <w:szCs w:val="22"/>
         </w:rPr>
-        <w:t xml:space="preserve">Antes del detalle técnico, lo que De Paseo en Fincas debe tener al día para que el asistente siga funcionando. El primer punto es urgente.</w:t>
+        <w:t xml:space="preserve">El asistente usa varios servicios de terceros. Algunos son gratuitos (software instalado en servidor propio); otros cobran por uso y necesitan una tarjeta vigente. Esta página resume dónde está cada cosa, a nombre de quién está hoy y qué debe hacer De Paseo en Fincas para que la operación quede a su nombre y no se detenga.</w:t>
       </w:r>
     </w:p>
     <w:p>
@@ -244,7 +244,7 @@
                 <w:sz w:val="22"/>
                 <w:szCs w:val="22"/>
               </w:rPr>
-              <w:t xml:space="preserve">⚠️ Acción requerida esta semana: método de pago en Meta (WhatsApp Business)</w:t>
+              <w:t xml:space="preserve">⚠️ Urgente</w:t>
             </w:r>
           </w:p>
           <w:p>
@@ -258,7 +258,7 @@
                 <w:sz w:val="20"/>
                 <w:szCs w:val="20"/>
               </w:rPr>
-              <w:t xml:space="preserve">En WhatsApp Manager, la cuenta "De Paseo En Fincas raaamp" muestra la alerta "Se requiere un método de pago válido: tu método de pago caducó o no es válido". Meta regala 1.000 conversaciones de servicio al mes; al agotarse, bloquea el envío y el asistente deja de responder. Además, los mensajes con plantilla (seguimientos después de 24 horas y avisos al asesor) se cobran por conversación y no salen sin un método de pago válido. Este mes van 163 mensajes, todos dentro de la cuota gratuita.</w:t>
+              <w:t xml:space="preserve">Meta (WhatsApp Business) muestra "método de pago vencido o no válido" en la cuenta "De Paseo En Fincas raaamp". Al agotar las 1.000 conversaciones gratuitas del mes el asistente deja de responder. Es el primer punto de la tabla y del paso a paso de la sección 2.</w:t>
             </w:r>
           </w:p>
         </w:tc>
@@ -269,12 +269,1513 @@
         <w:spacing w:after="0" w:before="120"/>
       </w:pPr>
     </w:p>
+    <w:tbl>
+      <w:tblPr>
+        <w:tblW w:type="dxa" w:w="9360"/>
+        <w:tblBorders>
+          <w:top w:val="single" w:color="auto" w:sz="4"/>
+          <w:left w:val="single" w:color="auto" w:sz="4"/>
+          <w:bottom w:val="single" w:color="auto" w:sz="4"/>
+          <w:right w:val="single" w:color="auto" w:sz="4"/>
+          <w:insideH w:val="single" w:color="auto" w:sz="4"/>
+          <w:insideV w:val="single" w:color="auto" w:sz="4"/>
+        </w:tblBorders>
+      </w:tblPr>
+      <w:tblGrid>
+        <w:gridCol w:w="1900"/>
+        <w:gridCol w:w="2100"/>
+        <w:gridCol w:w="1700"/>
+        <w:gridCol w:w="2560"/>
+        <w:gridCol w:w="1100"/>
+      </w:tblGrid>
+      <w:tr>
+        <w:tc>
+          <w:tcPr>
+            <w:tcW w:type="dxa" w:w="1900"/>
+            <w:tcBorders>
+              <w:top w:val="single" w:color="E0E0E0" w:sz="1"/>
+              <w:left w:val="single" w:color="E0E0E0" w:sz="1"/>
+              <w:bottom w:val="single" w:color="E0E0E0" w:sz="1"/>
+              <w:right w:val="single" w:color="E0E0E0" w:sz="1"/>
+            </w:tcBorders>
+            <w:shd w:fill="2E7D32" w:val="clear"/>
+            <w:tcMar>
+              <w:top w:type="dxa" w:w="80"/>
+              <w:left w:type="dxa" w:w="120"/>
+              <w:bottom w:type="dxa" w:w="80"/>
+              <w:right w:type="dxa" w:w="120"/>
+            </w:tcMar>
+          </w:tcPr>
+          <w:p>
+            <w:r>
+              <w:rPr>
+                <w:rFonts w:ascii="Arial" w:cs="Arial" w:eastAsia="Arial" w:hAnsi="Arial"/>
+                <w:b/>
+                <w:bCs/>
+                <w:color w:val="FFFFFF"/>
+                <w:sz w:val="20"/>
+                <w:szCs w:val="20"/>
+              </w:rPr>
+              <w:t xml:space="preserve">Servicio</w:t>
+            </w:r>
+          </w:p>
+        </w:tc>
+        <w:tc>
+          <w:tcPr>
+            <w:tcW w:type="dxa" w:w="2100"/>
+            <w:tcBorders>
+              <w:top w:val="single" w:color="E0E0E0" w:sz="1"/>
+              <w:left w:val="single" w:color="E0E0E0" w:sz="1"/>
+              <w:bottom w:val="single" w:color="E0E0E0" w:sz="1"/>
+              <w:right w:val="single" w:color="E0E0E0" w:sz="1"/>
+            </w:tcBorders>
+            <w:shd w:fill="2E7D32" w:val="clear"/>
+            <w:tcMar>
+              <w:top w:type="dxa" w:w="80"/>
+              <w:left w:type="dxa" w:w="120"/>
+              <w:bottom w:type="dxa" w:w="80"/>
+              <w:right w:type="dxa" w:w="120"/>
+            </w:tcMar>
+          </w:tcPr>
+          <w:p>
+            <w:r>
+              <w:rPr>
+                <w:rFonts w:ascii="Arial" w:cs="Arial" w:eastAsia="Arial" w:hAnsi="Arial"/>
+                <w:b/>
+                <w:bCs/>
+                <w:color w:val="FFFFFF"/>
+                <w:sz w:val="20"/>
+                <w:szCs w:val="20"/>
+              </w:rPr>
+              <w:t xml:space="preserve">Para qué</w:t>
+            </w:r>
+          </w:p>
+        </w:tc>
+        <w:tc>
+          <w:tcPr>
+            <w:tcW w:type="dxa" w:w="1700"/>
+            <w:tcBorders>
+              <w:top w:val="single" w:color="E0E0E0" w:sz="1"/>
+              <w:left w:val="single" w:color="E0E0E0" w:sz="1"/>
+              <w:bottom w:val="single" w:color="E0E0E0" w:sz="1"/>
+              <w:right w:val="single" w:color="E0E0E0" w:sz="1"/>
+            </w:tcBorders>
+            <w:shd w:fill="2E7D32" w:val="clear"/>
+            <w:tcMar>
+              <w:top w:type="dxa" w:w="80"/>
+              <w:left w:type="dxa" w:w="120"/>
+              <w:bottom w:type="dxa" w:w="80"/>
+              <w:right w:type="dxa" w:w="120"/>
+            </w:tcMar>
+          </w:tcPr>
+          <w:p>
+            <w:r>
+              <w:rPr>
+                <w:rFonts w:ascii="Arial" w:cs="Arial" w:eastAsia="Arial" w:hAnsi="Arial"/>
+                <w:b/>
+                <w:bCs/>
+                <w:color w:val="FFFFFF"/>
+                <w:sz w:val="20"/>
+                <w:szCs w:val="20"/>
+              </w:rPr>
+              <w:t xml:space="preserve">Cuenta hoy</w:t>
+            </w:r>
+          </w:p>
+        </w:tc>
+        <w:tc>
+          <w:tcPr>
+            <w:tcW w:type="dxa" w:w="2560"/>
+            <w:tcBorders>
+              <w:top w:val="single" w:color="E0E0E0" w:sz="1"/>
+              <w:left w:val="single" w:color="E0E0E0" w:sz="1"/>
+              <w:bottom w:val="single" w:color="E0E0E0" w:sz="1"/>
+              <w:right w:val="single" w:color="E0E0E0" w:sz="1"/>
+            </w:tcBorders>
+            <w:shd w:fill="2E7D32" w:val="clear"/>
+            <w:tcMar>
+              <w:top w:type="dxa" w:w="80"/>
+              <w:left w:type="dxa" w:w="120"/>
+              <w:bottom w:type="dxa" w:w="80"/>
+              <w:right w:type="dxa" w:w="120"/>
+            </w:tcMar>
+          </w:tcPr>
+          <w:p>
+            <w:r>
+              <w:rPr>
+                <w:rFonts w:ascii="Arial" w:cs="Arial" w:eastAsia="Arial" w:hAnsi="Arial"/>
+                <w:b/>
+                <w:bCs/>
+                <w:color w:val="FFFFFF"/>
+                <w:sz w:val="20"/>
+                <w:szCs w:val="20"/>
+              </w:rPr>
+              <w:t xml:space="preserve">Qué debe hacer De Paseo en Fincas</w:t>
+            </w:r>
+          </w:p>
+        </w:tc>
+        <w:tc>
+          <w:tcPr>
+            <w:tcW w:type="dxa" w:w="1100"/>
+            <w:tcBorders>
+              <w:top w:val="single" w:color="E0E0E0" w:sz="1"/>
+              <w:left w:val="single" w:color="E0E0E0" w:sz="1"/>
+              <w:bottom w:val="single" w:color="E0E0E0" w:sz="1"/>
+              <w:right w:val="single" w:color="E0E0E0" w:sz="1"/>
+            </w:tcBorders>
+            <w:shd w:fill="2E7D32" w:val="clear"/>
+            <w:tcMar>
+              <w:top w:type="dxa" w:w="80"/>
+              <w:left w:type="dxa" w:w="120"/>
+              <w:bottom w:type="dxa" w:w="80"/>
+              <w:right w:type="dxa" w:w="120"/>
+            </w:tcMar>
+          </w:tcPr>
+          <w:p>
+            <w:r>
+              <w:rPr>
+                <w:rFonts w:ascii="Arial" w:cs="Arial" w:eastAsia="Arial" w:hAnsi="Arial"/>
+                <w:b/>
+                <w:bCs/>
+                <w:color w:val="FFFFFF"/>
+                <w:sz w:val="20"/>
+                <w:szCs w:val="20"/>
+              </w:rPr>
+              <w:t xml:space="preserve">Costo aprox.</w:t>
+            </w:r>
+          </w:p>
+        </w:tc>
+      </w:tr>
+      <w:tr>
+        <w:tc>
+          <w:tcPr>
+            <w:tcW w:type="dxa" w:w="1900"/>
+            <w:tcBorders>
+              <w:top w:val="single" w:color="E0E0E0" w:sz="1"/>
+              <w:left w:val="single" w:color="E0E0E0" w:sz="1"/>
+              <w:bottom w:val="single" w:color="E0E0E0" w:sz="1"/>
+              <w:right w:val="single" w:color="E0E0E0" w:sz="1"/>
+            </w:tcBorders>
+            <w:tcMar>
+              <w:top w:type="dxa" w:w="80"/>
+              <w:left w:type="dxa" w:w="120"/>
+              <w:bottom w:type="dxa" w:w="80"/>
+              <w:right w:type="dxa" w:w="120"/>
+            </w:tcMar>
+          </w:tcPr>
+          <w:p>
+            <w:r>
+              <w:rPr>
+                <w:rFonts w:ascii="Arial" w:cs="Arial" w:eastAsia="Arial" w:hAnsi="Arial"/>
+                <w:color w:val="212121"/>
+                <w:sz w:val="20"/>
+                <w:szCs w:val="20"/>
+              </w:rPr>
+              <w:t xml:space="preserve">Meta · WhatsApp Business (Cloud API)</w:t>
+            </w:r>
+          </w:p>
+        </w:tc>
+        <w:tc>
+          <w:tcPr>
+            <w:tcW w:type="dxa" w:w="2100"/>
+            <w:tcBorders>
+              <w:top w:val="single" w:color="E0E0E0" w:sz="1"/>
+              <w:left w:val="single" w:color="E0E0E0" w:sz="1"/>
+              <w:bottom w:val="single" w:color="E0E0E0" w:sz="1"/>
+              <w:right w:val="single" w:color="E0E0E0" w:sz="1"/>
+            </w:tcBorders>
+            <w:tcMar>
+              <w:top w:type="dxa" w:w="80"/>
+              <w:left w:type="dxa" w:w="120"/>
+              <w:bottom w:type="dxa" w:w="80"/>
+              <w:right w:type="dxa" w:w="120"/>
+            </w:tcMar>
+          </w:tcPr>
+          <w:p>
+            <w:r>
+              <w:rPr>
+                <w:rFonts w:ascii="Arial" w:cs="Arial" w:eastAsia="Arial" w:hAnsi="Arial"/>
+                <w:color w:val="212121"/>
+                <w:sz w:val="20"/>
+                <w:szCs w:val="20"/>
+              </w:rPr>
+              <w:t xml:space="preserve">La línea +1 201-701-8810 con la que el asistente habla con los clientes</w:t>
+            </w:r>
+          </w:p>
+        </w:tc>
+        <w:tc>
+          <w:tcPr>
+            <w:tcW w:type="dxa" w:w="1700"/>
+            <w:tcBorders>
+              <w:top w:val="single" w:color="E0E0E0" w:sz="1"/>
+              <w:left w:val="single" w:color="E0E0E0" w:sz="1"/>
+              <w:bottom w:val="single" w:color="E0E0E0" w:sz="1"/>
+              <w:right w:val="single" w:color="E0E0E0" w:sz="1"/>
+            </w:tcBorders>
+            <w:tcMar>
+              <w:top w:type="dxa" w:w="80"/>
+              <w:left w:type="dxa" w:w="120"/>
+              <w:bottom w:type="dxa" w:w="80"/>
+              <w:right w:type="dxa" w:w="120"/>
+            </w:tcMar>
+          </w:tcPr>
+          <w:p>
+            <w:r>
+              <w:rPr>
+                <w:rFonts w:ascii="Arial" w:cs="Arial" w:eastAsia="Arial" w:hAnsi="Arial"/>
+                <w:color w:val="212121"/>
+                <w:sz w:val="20"/>
+                <w:szCs w:val="20"/>
+              </w:rPr>
+              <w:t xml:space="preserve">Cuenta "De Paseo En Fincas raaamp" en Meta Business</w:t>
+            </w:r>
+          </w:p>
+        </w:tc>
+        <w:tc>
+          <w:tcPr>
+            <w:tcW w:type="dxa" w:w="2560"/>
+            <w:tcBorders>
+              <w:top w:val="single" w:color="E0E0E0" w:sz="1"/>
+              <w:left w:val="single" w:color="E0E0E0" w:sz="1"/>
+              <w:bottom w:val="single" w:color="E0E0E0" w:sz="1"/>
+              <w:right w:val="single" w:color="E0E0E0" w:sz="1"/>
+            </w:tcBorders>
+            <w:tcMar>
+              <w:top w:type="dxa" w:w="80"/>
+              <w:left w:type="dxa" w:w="120"/>
+              <w:bottom w:type="dxa" w:w="80"/>
+              <w:right w:type="dxa" w:w="120"/>
+            </w:tcMar>
+          </w:tcPr>
+          <w:p>
+            <w:r>
+              <w:rPr>
+                <w:rFonts w:ascii="Arial" w:cs="Arial" w:eastAsia="Arial" w:hAnsi="Arial"/>
+                <w:color w:val="212121"/>
+                <w:sz w:val="20"/>
+                <w:szCs w:val="20"/>
+              </w:rPr>
+              <w:t xml:space="preserve">Poner tarjeta vigente en WhatsApp Manager → Configuración de pagos (sección 2.1). Si el negocio en Meta está bajo raaamp, pedir a raaamp acceso de administrador o la transferencia de la cuenta</w:t>
+            </w:r>
+          </w:p>
+        </w:tc>
+        <w:tc>
+          <w:tcPr>
+            <w:tcW w:type="dxa" w:w="1100"/>
+            <w:tcBorders>
+              <w:top w:val="single" w:color="E0E0E0" w:sz="1"/>
+              <w:left w:val="single" w:color="E0E0E0" w:sz="1"/>
+              <w:bottom w:val="single" w:color="E0E0E0" w:sz="1"/>
+              <w:right w:val="single" w:color="E0E0E0" w:sz="1"/>
+            </w:tcBorders>
+            <w:tcMar>
+              <w:top w:type="dxa" w:w="80"/>
+              <w:left w:type="dxa" w:w="120"/>
+              <w:bottom w:type="dxa" w:w="80"/>
+              <w:right w:type="dxa" w:w="120"/>
+            </w:tcMar>
+          </w:tcPr>
+          <w:p>
+            <w:r>
+              <w:rPr>
+                <w:rFonts w:ascii="Arial" w:cs="Arial" w:eastAsia="Arial" w:hAnsi="Arial"/>
+                <w:color w:val="212121"/>
+                <w:sz w:val="20"/>
+                <w:szCs w:val="20"/>
+              </w:rPr>
+              <w:t xml:space="preserve">1.000 conversaciones/mes gratis; después centavos de dólar por conversación (tarifas Meta Colombia)</w:t>
+            </w:r>
+          </w:p>
+        </w:tc>
+      </w:tr>
+      <w:tr>
+        <w:tc>
+          <w:tcPr>
+            <w:tcW w:type="dxa" w:w="1900"/>
+            <w:tcBorders>
+              <w:top w:val="single" w:color="E0E0E0" w:sz="1"/>
+              <w:left w:val="single" w:color="E0E0E0" w:sz="1"/>
+              <w:bottom w:val="single" w:color="E0E0E0" w:sz="1"/>
+              <w:right w:val="single" w:color="E0E0E0" w:sz="1"/>
+            </w:tcBorders>
+            <w:tcMar>
+              <w:top w:type="dxa" w:w="80"/>
+              <w:left w:type="dxa" w:w="120"/>
+              <w:bottom w:type="dxa" w:w="80"/>
+              <w:right w:type="dxa" w:w="120"/>
+            </w:tcMar>
+          </w:tcPr>
+          <w:p>
+            <w:r>
+              <w:rPr>
+                <w:rFonts w:ascii="Arial" w:cs="Arial" w:eastAsia="Arial" w:hAnsi="Arial"/>
+                <w:color w:val="212121"/>
+                <w:sz w:val="20"/>
+                <w:szCs w:val="20"/>
+              </w:rPr>
+              <w:t xml:space="preserve">Google Gemini (IA)</w:t>
+            </w:r>
+          </w:p>
+        </w:tc>
+        <w:tc>
+          <w:tcPr>
+            <w:tcW w:type="dxa" w:w="2100"/>
+            <w:tcBorders>
+              <w:top w:val="single" w:color="E0E0E0" w:sz="1"/>
+              <w:left w:val="single" w:color="E0E0E0" w:sz="1"/>
+              <w:bottom w:val="single" w:color="E0E0E0" w:sz="1"/>
+              <w:right w:val="single" w:color="E0E0E0" w:sz="1"/>
+            </w:tcBorders>
+            <w:tcMar>
+              <w:top w:type="dxa" w:w="80"/>
+              <w:left w:type="dxa" w:w="120"/>
+              <w:bottom w:type="dxa" w:w="80"/>
+              <w:right w:type="dxa" w:w="120"/>
+            </w:tcMar>
+          </w:tcPr>
+          <w:p>
+            <w:r>
+              <w:rPr>
+                <w:rFonts w:ascii="Arial" w:cs="Arial" w:eastAsia="Arial" w:hAnsi="Arial"/>
+                <w:color w:val="212121"/>
+                <w:sz w:val="20"/>
+                <w:szCs w:val="20"/>
+              </w:rPr>
+              <w:t xml:space="preserve">El modelo que redacta las respuestas</w:t>
+            </w:r>
+          </w:p>
+        </w:tc>
+        <w:tc>
+          <w:tcPr>
+            <w:tcW w:type="dxa" w:w="1700"/>
+            <w:tcBorders>
+              <w:top w:val="single" w:color="E0E0E0" w:sz="1"/>
+              <w:left w:val="single" w:color="E0E0E0" w:sz="1"/>
+              <w:bottom w:val="single" w:color="E0E0E0" w:sz="1"/>
+              <w:right w:val="single" w:color="E0E0E0" w:sz="1"/>
+            </w:tcBorders>
+            <w:tcMar>
+              <w:top w:type="dxa" w:w="80"/>
+              <w:left w:type="dxa" w:w="120"/>
+              <w:bottom w:type="dxa" w:w="80"/>
+              <w:right w:type="dxa" w:w="120"/>
+            </w:tcMar>
+          </w:tcPr>
+          <w:p>
+            <w:r>
+              <w:rPr>
+                <w:rFonts w:ascii="Arial" w:cs="Arial" w:eastAsia="Arial" w:hAnsi="Arial"/>
+                <w:color w:val="212121"/>
+                <w:sz w:val="20"/>
+                <w:szCs w:val="20"/>
+              </w:rPr>
+              <w:t xml:space="preserve">Clave de API creada por raaamp</w:t>
+            </w:r>
+          </w:p>
+        </w:tc>
+        <w:tc>
+          <w:tcPr>
+            <w:tcW w:type="dxa" w:w="2560"/>
+            <w:tcBorders>
+              <w:top w:val="single" w:color="E0E0E0" w:sz="1"/>
+              <w:left w:val="single" w:color="E0E0E0" w:sz="1"/>
+              <w:bottom w:val="single" w:color="E0E0E0" w:sz="1"/>
+              <w:right w:val="single" w:color="E0E0E0" w:sz="1"/>
+            </w:tcBorders>
+            <w:tcMar>
+              <w:top w:type="dxa" w:w="80"/>
+              <w:left w:type="dxa" w:w="120"/>
+              <w:bottom w:type="dxa" w:w="80"/>
+              <w:right w:type="dxa" w:w="120"/>
+            </w:tcMar>
+          </w:tcPr>
+          <w:p>
+            <w:r>
+              <w:rPr>
+                <w:rFonts w:ascii="Arial" w:cs="Arial" w:eastAsia="Arial" w:hAnsi="Arial"/>
+                <w:color w:val="212121"/>
+                <w:sz w:val="20"/>
+                <w:szCs w:val="20"/>
+              </w:rPr>
+              <w:t xml:space="preserve">Crear su propia clave en Google AI Studio con facturación de Google Cloud y su tarjeta (sección 2.2); raaamp la instala en n8n</w:t>
+            </w:r>
+          </w:p>
+        </w:tc>
+        <w:tc>
+          <w:tcPr>
+            <w:tcW w:type="dxa" w:w="1100"/>
+            <w:tcBorders>
+              <w:top w:val="single" w:color="E0E0E0" w:sz="1"/>
+              <w:left w:val="single" w:color="E0E0E0" w:sz="1"/>
+              <w:bottom w:val="single" w:color="E0E0E0" w:sz="1"/>
+              <w:right w:val="single" w:color="E0E0E0" w:sz="1"/>
+            </w:tcBorders>
+            <w:tcMar>
+              <w:top w:type="dxa" w:w="80"/>
+              <w:left w:type="dxa" w:w="120"/>
+              <w:bottom w:type="dxa" w:w="80"/>
+              <w:right w:type="dxa" w:w="120"/>
+            </w:tcMar>
+          </w:tcPr>
+          <w:p>
+            <w:r>
+              <w:rPr>
+                <w:rFonts w:ascii="Arial" w:cs="Arial" w:eastAsia="Arial" w:hAnsi="Arial"/>
+                <w:color w:val="212121"/>
+                <w:sz w:val="20"/>
+                <w:szCs w:val="20"/>
+              </w:rPr>
+              <w:t xml:space="preserve">Por uso: US$10 a 30/mes con el tráfico actual</w:t>
+            </w:r>
+          </w:p>
+        </w:tc>
+      </w:tr>
+      <w:tr>
+        <w:tc>
+          <w:tcPr>
+            <w:tcW w:type="dxa" w:w="1900"/>
+            <w:tcBorders>
+              <w:top w:val="single" w:color="E0E0E0" w:sz="1"/>
+              <w:left w:val="single" w:color="E0E0E0" w:sz="1"/>
+              <w:bottom w:val="single" w:color="E0E0E0" w:sz="1"/>
+              <w:right w:val="single" w:color="E0E0E0" w:sz="1"/>
+            </w:tcBorders>
+            <w:tcMar>
+              <w:top w:type="dxa" w:w="80"/>
+              <w:left w:type="dxa" w:w="120"/>
+              <w:bottom w:type="dxa" w:w="80"/>
+              <w:right w:type="dxa" w:w="120"/>
+            </w:tcMar>
+          </w:tcPr>
+          <w:p>
+            <w:r>
+              <w:rPr>
+                <w:rFonts w:ascii="Arial" w:cs="Arial" w:eastAsia="Arial" w:hAnsi="Arial"/>
+                <w:color w:val="212121"/>
+                <w:sz w:val="20"/>
+                <w:szCs w:val="20"/>
+              </w:rPr>
+              <w:t xml:space="preserve">OpenAI (transcripción de audios)</w:t>
+            </w:r>
+          </w:p>
+        </w:tc>
+        <w:tc>
+          <w:tcPr>
+            <w:tcW w:type="dxa" w:w="2100"/>
+            <w:tcBorders>
+              <w:top w:val="single" w:color="E0E0E0" w:sz="1"/>
+              <w:left w:val="single" w:color="E0E0E0" w:sz="1"/>
+              <w:bottom w:val="single" w:color="E0E0E0" w:sz="1"/>
+              <w:right w:val="single" w:color="E0E0E0" w:sz="1"/>
+            </w:tcBorders>
+            <w:tcMar>
+              <w:top w:type="dxa" w:w="80"/>
+              <w:left w:type="dxa" w:w="120"/>
+              <w:bottom w:type="dxa" w:w="80"/>
+              <w:right w:type="dxa" w:w="120"/>
+            </w:tcMar>
+          </w:tcPr>
+          <w:p>
+            <w:r>
+              <w:rPr>
+                <w:rFonts w:ascii="Arial" w:cs="Arial" w:eastAsia="Arial" w:hAnsi="Arial"/>
+                <w:color w:val="212121"/>
+                <w:sz w:val="20"/>
+                <w:szCs w:val="20"/>
+              </w:rPr>
+              <w:t xml:space="preserve">Convierte las notas de voz de los clientes en texto</w:t>
+            </w:r>
+          </w:p>
+        </w:tc>
+        <w:tc>
+          <w:tcPr>
+            <w:tcW w:type="dxa" w:w="1700"/>
+            <w:tcBorders>
+              <w:top w:val="single" w:color="E0E0E0" w:sz="1"/>
+              <w:left w:val="single" w:color="E0E0E0" w:sz="1"/>
+              <w:bottom w:val="single" w:color="E0E0E0" w:sz="1"/>
+              <w:right w:val="single" w:color="E0E0E0" w:sz="1"/>
+            </w:tcBorders>
+            <w:tcMar>
+              <w:top w:type="dxa" w:w="80"/>
+              <w:left w:type="dxa" w:w="120"/>
+              <w:bottom w:type="dxa" w:w="80"/>
+              <w:right w:type="dxa" w:w="120"/>
+            </w:tcMar>
+          </w:tcPr>
+          <w:p>
+            <w:r>
+              <w:rPr>
+                <w:rFonts w:ascii="Arial" w:cs="Arial" w:eastAsia="Arial" w:hAnsi="Arial"/>
+                <w:color w:val="212121"/>
+                <w:sz w:val="20"/>
+                <w:szCs w:val="20"/>
+              </w:rPr>
+              <w:t xml:space="preserve">Clave de API de raaamp</w:t>
+            </w:r>
+          </w:p>
+        </w:tc>
+        <w:tc>
+          <w:tcPr>
+            <w:tcW w:type="dxa" w:w="2560"/>
+            <w:tcBorders>
+              <w:top w:val="single" w:color="E0E0E0" w:sz="1"/>
+              <w:left w:val="single" w:color="E0E0E0" w:sz="1"/>
+              <w:bottom w:val="single" w:color="E0E0E0" w:sz="1"/>
+              <w:right w:val="single" w:color="E0E0E0" w:sz="1"/>
+            </w:tcBorders>
+            <w:tcMar>
+              <w:top w:type="dxa" w:w="80"/>
+              <w:left w:type="dxa" w:w="120"/>
+              <w:bottom w:type="dxa" w:w="80"/>
+              <w:right w:type="dxa" w:w="120"/>
+            </w:tcMar>
+          </w:tcPr>
+          <w:p>
+            <w:r>
+              <w:rPr>
+                <w:rFonts w:ascii="Arial" w:cs="Arial" w:eastAsia="Arial" w:hAnsi="Arial"/>
+                <w:color w:val="212121"/>
+                <w:sz w:val="20"/>
+                <w:szCs w:val="20"/>
+              </w:rPr>
+              <w:t xml:space="preserve">Crear cuenta en platform.openai.com, poner tarjeta y generar clave (sección 2.3); raaamp la instala</w:t>
+            </w:r>
+          </w:p>
+        </w:tc>
+        <w:tc>
+          <w:tcPr>
+            <w:tcW w:type="dxa" w:w="1100"/>
+            <w:tcBorders>
+              <w:top w:val="single" w:color="E0E0E0" w:sz="1"/>
+              <w:left w:val="single" w:color="E0E0E0" w:sz="1"/>
+              <w:bottom w:val="single" w:color="E0E0E0" w:sz="1"/>
+              <w:right w:val="single" w:color="E0E0E0" w:sz="1"/>
+            </w:tcBorders>
+            <w:tcMar>
+              <w:top w:type="dxa" w:w="80"/>
+              <w:left w:type="dxa" w:w="120"/>
+              <w:bottom w:type="dxa" w:w="80"/>
+              <w:right w:type="dxa" w:w="120"/>
+            </w:tcMar>
+          </w:tcPr>
+          <w:p>
+            <w:r>
+              <w:rPr>
+                <w:rFonts w:ascii="Arial" w:cs="Arial" w:eastAsia="Arial" w:hAnsi="Arial"/>
+                <w:color w:val="212121"/>
+                <w:sz w:val="20"/>
+                <w:szCs w:val="20"/>
+              </w:rPr>
+              <w:t xml:space="preserve">Menos de US$5/mes</w:t>
+            </w:r>
+          </w:p>
+        </w:tc>
+      </w:tr>
+      <w:tr>
+        <w:tc>
+          <w:tcPr>
+            <w:tcW w:type="dxa" w:w="1900"/>
+            <w:tcBorders>
+              <w:top w:val="single" w:color="E0E0E0" w:sz="1"/>
+              <w:left w:val="single" w:color="E0E0E0" w:sz="1"/>
+              <w:bottom w:val="single" w:color="E0E0E0" w:sz="1"/>
+              <w:right w:val="single" w:color="E0E0E0" w:sz="1"/>
+            </w:tcBorders>
+            <w:tcMar>
+              <w:top w:type="dxa" w:w="80"/>
+              <w:left w:type="dxa" w:w="120"/>
+              <w:bottom w:type="dxa" w:w="80"/>
+              <w:right w:type="dxa" w:w="120"/>
+            </w:tcMar>
+          </w:tcPr>
+          <w:p>
+            <w:r>
+              <w:rPr>
+                <w:rFonts w:ascii="Arial" w:cs="Arial" w:eastAsia="Arial" w:hAnsi="Arial"/>
+                <w:color w:val="212121"/>
+                <w:sz w:val="20"/>
+                <w:szCs w:val="20"/>
+              </w:rPr>
+              <w:t xml:space="preserve">Servidor Hetzner (n8n + Chatwoot)</w:t>
+            </w:r>
+          </w:p>
+        </w:tc>
+        <w:tc>
+          <w:tcPr>
+            <w:tcW w:type="dxa" w:w="2100"/>
+            <w:tcBorders>
+              <w:top w:val="single" w:color="E0E0E0" w:sz="1"/>
+              <w:left w:val="single" w:color="E0E0E0" w:sz="1"/>
+              <w:bottom w:val="single" w:color="E0E0E0" w:sz="1"/>
+              <w:right w:val="single" w:color="E0E0E0" w:sz="1"/>
+            </w:tcBorders>
+            <w:tcMar>
+              <w:top w:type="dxa" w:w="80"/>
+              <w:left w:type="dxa" w:w="120"/>
+              <w:bottom w:type="dxa" w:w="80"/>
+              <w:right w:type="dxa" w:w="120"/>
+            </w:tcMar>
+          </w:tcPr>
+          <w:p>
+            <w:r>
+              <w:rPr>
+                <w:rFonts w:ascii="Arial" w:cs="Arial" w:eastAsia="Arial" w:hAnsi="Arial"/>
+                <w:color w:val="212121"/>
+                <w:sz w:val="20"/>
+                <w:szCs w:val="20"/>
+              </w:rPr>
+              <w:t xml:space="preserve">Aloja n8n (automatización), Chatwoot (bandeja de WhatsApp) y el conversor de PDF. Servidor "n8n-depaseoenfincas-hetzner", 4 CPU / 8 GB / 75 GB</w:t>
+            </w:r>
+          </w:p>
+        </w:tc>
+        <w:tc>
+          <w:tcPr>
+            <w:tcW w:type="dxa" w:w="1700"/>
+            <w:tcBorders>
+              <w:top w:val="single" w:color="E0E0E0" w:sz="1"/>
+              <w:left w:val="single" w:color="E0E0E0" w:sz="1"/>
+              <w:bottom w:val="single" w:color="E0E0E0" w:sz="1"/>
+              <w:right w:val="single" w:color="E0E0E0" w:sz="1"/>
+            </w:tcBorders>
+            <w:tcMar>
+              <w:top w:type="dxa" w:w="80"/>
+              <w:left w:type="dxa" w:w="120"/>
+              <w:bottom w:type="dxa" w:w="80"/>
+              <w:right w:type="dxa" w:w="120"/>
+            </w:tcMar>
+          </w:tcPr>
+          <w:p>
+            <w:r>
+              <w:rPr>
+                <w:rFonts w:ascii="Arial" w:cs="Arial" w:eastAsia="Arial" w:hAnsi="Arial"/>
+                <w:color w:val="212121"/>
+                <w:sz w:val="20"/>
+                <w:szCs w:val="20"/>
+              </w:rPr>
+              <w:t xml:space="preserve">Cuenta Hetzner de raaamp</w:t>
+            </w:r>
+          </w:p>
+        </w:tc>
+        <w:tc>
+          <w:tcPr>
+            <w:tcW w:type="dxa" w:w="2560"/>
+            <w:tcBorders>
+              <w:top w:val="single" w:color="E0E0E0" w:sz="1"/>
+              <w:left w:val="single" w:color="E0E0E0" w:sz="1"/>
+              <w:bottom w:val="single" w:color="E0E0E0" w:sz="1"/>
+              <w:right w:val="single" w:color="E0E0E0" w:sz="1"/>
+            </w:tcBorders>
+            <w:tcMar>
+              <w:top w:type="dxa" w:w="80"/>
+              <w:left w:type="dxa" w:w="120"/>
+              <w:bottom w:type="dxa" w:w="80"/>
+              <w:right w:type="dxa" w:w="120"/>
+            </w:tcMar>
+          </w:tcPr>
+          <w:p>
+            <w:r>
+              <w:rPr>
+                <w:rFonts w:ascii="Arial" w:cs="Arial" w:eastAsia="Arial" w:hAnsi="Arial"/>
+                <w:color w:val="212121"/>
+                <w:sz w:val="20"/>
+                <w:szCs w:val="20"/>
+              </w:rPr>
+              <w:t xml:space="preserve">Opción A: raaamp lo factura mensualmente. Opción B: abrir cuenta propia en Hetzner con su tarjeta y raaamp transfiere el proyecto (sección 2.4)</w:t>
+            </w:r>
+          </w:p>
+        </w:tc>
+        <w:tc>
+          <w:tcPr>
+            <w:tcW w:type="dxa" w:w="1100"/>
+            <w:tcBorders>
+              <w:top w:val="single" w:color="E0E0E0" w:sz="1"/>
+              <w:left w:val="single" w:color="E0E0E0" w:sz="1"/>
+              <w:bottom w:val="single" w:color="E0E0E0" w:sz="1"/>
+              <w:right w:val="single" w:color="E0E0E0" w:sz="1"/>
+            </w:tcBorders>
+            <w:tcMar>
+              <w:top w:type="dxa" w:w="80"/>
+              <w:left w:type="dxa" w:w="120"/>
+              <w:bottom w:type="dxa" w:w="80"/>
+              <w:right w:type="dxa" w:w="120"/>
+            </w:tcMar>
+          </w:tcPr>
+          <w:p>
+            <w:r>
+              <w:rPr>
+                <w:rFonts w:ascii="Arial" w:cs="Arial" w:eastAsia="Arial" w:hAnsi="Arial"/>
+                <w:color w:val="212121"/>
+                <w:sz w:val="20"/>
+                <w:szCs w:val="20"/>
+              </w:rPr>
+              <w:t xml:space="preserve">Aprox. US$18/mes (plan CPX31)</w:t>
+            </w:r>
+          </w:p>
+        </w:tc>
+      </w:tr>
+      <w:tr>
+        <w:tc>
+          <w:tcPr>
+            <w:tcW w:type="dxa" w:w="1900"/>
+            <w:tcBorders>
+              <w:top w:val="single" w:color="E0E0E0" w:sz="1"/>
+              <w:left w:val="single" w:color="E0E0E0" w:sz="1"/>
+              <w:bottom w:val="single" w:color="E0E0E0" w:sz="1"/>
+              <w:right w:val="single" w:color="E0E0E0" w:sz="1"/>
+            </w:tcBorders>
+            <w:tcMar>
+              <w:top w:type="dxa" w:w="80"/>
+              <w:left w:type="dxa" w:w="120"/>
+              <w:bottom w:type="dxa" w:w="80"/>
+              <w:right w:type="dxa" w:w="120"/>
+            </w:tcMar>
+          </w:tcPr>
+          <w:p>
+            <w:r>
+              <w:rPr>
+                <w:rFonts w:ascii="Arial" w:cs="Arial" w:eastAsia="Arial" w:hAnsi="Arial"/>
+                <w:color w:val="212121"/>
+                <w:sz w:val="20"/>
+                <w:szCs w:val="20"/>
+              </w:rPr>
+              <w:t xml:space="preserve">n8n y Chatwoot (software)</w:t>
+            </w:r>
+          </w:p>
+        </w:tc>
+        <w:tc>
+          <w:tcPr>
+            <w:tcW w:type="dxa" w:w="2100"/>
+            <w:tcBorders>
+              <w:top w:val="single" w:color="E0E0E0" w:sz="1"/>
+              <w:left w:val="single" w:color="E0E0E0" w:sz="1"/>
+              <w:bottom w:val="single" w:color="E0E0E0" w:sz="1"/>
+              <w:right w:val="single" w:color="E0E0E0" w:sz="1"/>
+            </w:tcBorders>
+            <w:tcMar>
+              <w:top w:type="dxa" w:w="80"/>
+              <w:left w:type="dxa" w:w="120"/>
+              <w:bottom w:type="dxa" w:w="80"/>
+              <w:right w:type="dxa" w:w="120"/>
+            </w:tcMar>
+          </w:tcPr>
+          <w:p>
+            <w:r>
+              <w:rPr>
+                <w:rFonts w:ascii="Arial" w:cs="Arial" w:eastAsia="Arial" w:hAnsi="Arial"/>
+                <w:color w:val="212121"/>
+                <w:sz w:val="20"/>
+                <w:szCs w:val="20"/>
+              </w:rPr>
+              <w:t xml:space="preserve">Automatización y bandeja de mensajes, instalados en el servidor anterior</w:t>
+            </w:r>
+          </w:p>
+        </w:tc>
+        <w:tc>
+          <w:tcPr>
+            <w:tcW w:type="dxa" w:w="1700"/>
+            <w:tcBorders>
+              <w:top w:val="single" w:color="E0E0E0" w:sz="1"/>
+              <w:left w:val="single" w:color="E0E0E0" w:sz="1"/>
+              <w:bottom w:val="single" w:color="E0E0E0" w:sz="1"/>
+              <w:right w:val="single" w:color="E0E0E0" w:sz="1"/>
+            </w:tcBorders>
+            <w:tcMar>
+              <w:top w:type="dxa" w:w="80"/>
+              <w:left w:type="dxa" w:w="120"/>
+              <w:bottom w:type="dxa" w:w="80"/>
+              <w:right w:type="dxa" w:w="120"/>
+            </w:tcMar>
+          </w:tcPr>
+          <w:p>
+            <w:r>
+              <w:rPr>
+                <w:rFonts w:ascii="Arial" w:cs="Arial" w:eastAsia="Arial" w:hAnsi="Arial"/>
+                <w:color w:val="212121"/>
+                <w:sz w:val="20"/>
+                <w:szCs w:val="20"/>
+              </w:rPr>
+              <w:t xml:space="preserve">Instalación propia (versión gratuita)</w:t>
+            </w:r>
+          </w:p>
+        </w:tc>
+        <w:tc>
+          <w:tcPr>
+            <w:tcW w:type="dxa" w:w="2560"/>
+            <w:tcBorders>
+              <w:top w:val="single" w:color="E0E0E0" w:sz="1"/>
+              <w:left w:val="single" w:color="E0E0E0" w:sz="1"/>
+              <w:bottom w:val="single" w:color="E0E0E0" w:sz="1"/>
+              <w:right w:val="single" w:color="E0E0E0" w:sz="1"/>
+            </w:tcBorders>
+            <w:tcMar>
+              <w:top w:type="dxa" w:w="80"/>
+              <w:left w:type="dxa" w:w="120"/>
+              <w:bottom w:type="dxa" w:w="80"/>
+              <w:right w:type="dxa" w:w="120"/>
+            </w:tcMar>
+          </w:tcPr>
+          <w:p>
+            <w:r>
+              <w:rPr>
+                <w:rFonts w:ascii="Arial" w:cs="Arial" w:eastAsia="Arial" w:hAnsi="Arial"/>
+                <w:color w:val="212121"/>
+                <w:sz w:val="20"/>
+                <w:szCs w:val="20"/>
+              </w:rPr>
+              <w:t xml:space="preserve">Nada; no tienen licencia ni cobro</w:t>
+            </w:r>
+          </w:p>
+        </w:tc>
+        <w:tc>
+          <w:tcPr>
+            <w:tcW w:type="dxa" w:w="1100"/>
+            <w:tcBorders>
+              <w:top w:val="single" w:color="E0E0E0" w:sz="1"/>
+              <w:left w:val="single" w:color="E0E0E0" w:sz="1"/>
+              <w:bottom w:val="single" w:color="E0E0E0" w:sz="1"/>
+              <w:right w:val="single" w:color="E0E0E0" w:sz="1"/>
+            </w:tcBorders>
+            <w:tcMar>
+              <w:top w:type="dxa" w:w="80"/>
+              <w:left w:type="dxa" w:w="120"/>
+              <w:bottom w:type="dxa" w:w="80"/>
+              <w:right w:type="dxa" w:w="120"/>
+            </w:tcMar>
+          </w:tcPr>
+          <w:p>
+            <w:r>
+              <w:rPr>
+                <w:rFonts w:ascii="Arial" w:cs="Arial" w:eastAsia="Arial" w:hAnsi="Arial"/>
+                <w:color w:val="212121"/>
+                <w:sz w:val="20"/>
+                <w:szCs w:val="20"/>
+              </w:rPr>
+              <w:t xml:space="preserve">US$0</w:t>
+            </w:r>
+          </w:p>
+        </w:tc>
+      </w:tr>
+      <w:tr>
+        <w:tc>
+          <w:tcPr>
+            <w:tcW w:type="dxa" w:w="1900"/>
+            <w:tcBorders>
+              <w:top w:val="single" w:color="E0E0E0" w:sz="1"/>
+              <w:left w:val="single" w:color="E0E0E0" w:sz="1"/>
+              <w:bottom w:val="single" w:color="E0E0E0" w:sz="1"/>
+              <w:right w:val="single" w:color="E0E0E0" w:sz="1"/>
+            </w:tcBorders>
+            <w:tcMar>
+              <w:top w:type="dxa" w:w="80"/>
+              <w:left w:type="dxa" w:w="120"/>
+              <w:bottom w:type="dxa" w:w="80"/>
+              <w:right w:type="dxa" w:w="120"/>
+            </w:tcMar>
+          </w:tcPr>
+          <w:p>
+            <w:r>
+              <w:rPr>
+                <w:rFonts w:ascii="Arial" w:cs="Arial" w:eastAsia="Arial" w:hAnsi="Arial"/>
+                <w:color w:val="212121"/>
+                <w:sz w:val="20"/>
+                <w:szCs w:val="20"/>
+              </w:rPr>
+              <w:t xml:space="preserve">Supabase (base de datos)</w:t>
+            </w:r>
+          </w:p>
+        </w:tc>
+        <w:tc>
+          <w:tcPr>
+            <w:tcW w:type="dxa" w:w="2100"/>
+            <w:tcBorders>
+              <w:top w:val="single" w:color="E0E0E0" w:sz="1"/>
+              <w:left w:val="single" w:color="E0E0E0" w:sz="1"/>
+              <w:bottom w:val="single" w:color="E0E0E0" w:sz="1"/>
+              <w:right w:val="single" w:color="E0E0E0" w:sz="1"/>
+            </w:tcBorders>
+            <w:tcMar>
+              <w:top w:type="dxa" w:w="80"/>
+              <w:left w:type="dxa" w:w="120"/>
+              <w:bottom w:type="dxa" w:w="80"/>
+              <w:right w:type="dxa" w:w="120"/>
+            </w:tcMar>
+          </w:tcPr>
+          <w:p>
+            <w:r>
+              <w:rPr>
+                <w:rFonts w:ascii="Arial" w:cs="Arial" w:eastAsia="Arial" w:hAnsi="Arial"/>
+                <w:color w:val="212121"/>
+                <w:sz w:val="20"/>
+                <w:szCs w:val="20"/>
+              </w:rPr>
+              <w:t xml:space="preserve">Conversaciones, mensajes, configuración, archivo</w:t>
+            </w:r>
+          </w:p>
+        </w:tc>
+        <w:tc>
+          <w:tcPr>
+            <w:tcW w:type="dxa" w:w="1700"/>
+            <w:tcBorders>
+              <w:top w:val="single" w:color="E0E0E0" w:sz="1"/>
+              <w:left w:val="single" w:color="E0E0E0" w:sz="1"/>
+              <w:bottom w:val="single" w:color="E0E0E0" w:sz="1"/>
+              <w:right w:val="single" w:color="E0E0E0" w:sz="1"/>
+            </w:tcBorders>
+            <w:tcMar>
+              <w:top w:type="dxa" w:w="80"/>
+              <w:left w:type="dxa" w:w="120"/>
+              <w:bottom w:type="dxa" w:w="80"/>
+              <w:right w:type="dxa" w:w="120"/>
+            </w:tcMar>
+          </w:tcPr>
+          <w:p>
+            <w:r>
+              <w:rPr>
+                <w:rFonts w:ascii="Arial" w:cs="Arial" w:eastAsia="Arial" w:hAnsi="Arial"/>
+                <w:color w:val="212121"/>
+                <w:sz w:val="20"/>
+                <w:szCs w:val="20"/>
+              </w:rPr>
+              <w:t xml:space="preserve">Proyecto en cuenta de raaamp, plan gratuito (se pausa tras días sin uso)</w:t>
+            </w:r>
+          </w:p>
+        </w:tc>
+        <w:tc>
+          <w:tcPr>
+            <w:tcW w:type="dxa" w:w="2560"/>
+            <w:tcBorders>
+              <w:top w:val="single" w:color="E0E0E0" w:sz="1"/>
+              <w:left w:val="single" w:color="E0E0E0" w:sz="1"/>
+              <w:bottom w:val="single" w:color="E0E0E0" w:sz="1"/>
+              <w:right w:val="single" w:color="E0E0E0" w:sz="1"/>
+            </w:tcBorders>
+            <w:tcMar>
+              <w:top w:type="dxa" w:w="80"/>
+              <w:left w:type="dxa" w:w="120"/>
+              <w:bottom w:type="dxa" w:w="80"/>
+              <w:right w:type="dxa" w:w="120"/>
+            </w:tcMar>
+          </w:tcPr>
+          <w:p>
+            <w:r>
+              <w:rPr>
+                <w:rFonts w:ascii="Arial" w:cs="Arial" w:eastAsia="Arial" w:hAnsi="Arial"/>
+                <w:color w:val="212121"/>
+                <w:sz w:val="20"/>
+                <w:szCs w:val="20"/>
+              </w:rPr>
+              <w:t xml:space="preserve">Recomendado: plan Pro con su tarjeta, o transferir el proyecto a una organización propia (sección 2.5)</w:t>
+            </w:r>
+          </w:p>
+        </w:tc>
+        <w:tc>
+          <w:tcPr>
+            <w:tcW w:type="dxa" w:w="1100"/>
+            <w:tcBorders>
+              <w:top w:val="single" w:color="E0E0E0" w:sz="1"/>
+              <w:left w:val="single" w:color="E0E0E0" w:sz="1"/>
+              <w:bottom w:val="single" w:color="E0E0E0" w:sz="1"/>
+              <w:right w:val="single" w:color="E0E0E0" w:sz="1"/>
+            </w:tcBorders>
+            <w:tcMar>
+              <w:top w:type="dxa" w:w="80"/>
+              <w:left w:type="dxa" w:w="120"/>
+              <w:bottom w:type="dxa" w:w="80"/>
+              <w:right w:type="dxa" w:w="120"/>
+            </w:tcMar>
+          </w:tcPr>
+          <w:p>
+            <w:r>
+              <w:rPr>
+                <w:rFonts w:ascii="Arial" w:cs="Arial" w:eastAsia="Arial" w:hAnsi="Arial"/>
+                <w:color w:val="212121"/>
+                <w:sz w:val="20"/>
+                <w:szCs w:val="20"/>
+              </w:rPr>
+              <w:t xml:space="preserve">US$25/mes en Pro; US$0 en gratuito con riesgo de pausa</w:t>
+            </w:r>
+          </w:p>
+        </w:tc>
+      </w:tr>
+      <w:tr>
+        <w:tc>
+          <w:tcPr>
+            <w:tcW w:type="dxa" w:w="1900"/>
+            <w:tcBorders>
+              <w:top w:val="single" w:color="E0E0E0" w:sz="1"/>
+              <w:left w:val="single" w:color="E0E0E0" w:sz="1"/>
+              <w:bottom w:val="single" w:color="E0E0E0" w:sz="1"/>
+              <w:right w:val="single" w:color="E0E0E0" w:sz="1"/>
+            </w:tcBorders>
+            <w:tcMar>
+              <w:top w:type="dxa" w:w="80"/>
+              <w:left w:type="dxa" w:w="120"/>
+              <w:bottom w:type="dxa" w:w="80"/>
+              <w:right w:type="dxa" w:w="120"/>
+            </w:tcMar>
+          </w:tcPr>
+          <w:p>
+            <w:r>
+              <w:rPr>
+                <w:rFonts w:ascii="Arial" w:cs="Arial" w:eastAsia="Arial" w:hAnsi="Arial"/>
+                <w:color w:val="212121"/>
+                <w:sz w:val="20"/>
+                <w:szCs w:val="20"/>
+              </w:rPr>
+              <w:t xml:space="preserve">Vercel (panel de administración)</w:t>
+            </w:r>
+          </w:p>
+        </w:tc>
+        <w:tc>
+          <w:tcPr>
+            <w:tcW w:type="dxa" w:w="2100"/>
+            <w:tcBorders>
+              <w:top w:val="single" w:color="E0E0E0" w:sz="1"/>
+              <w:left w:val="single" w:color="E0E0E0" w:sz="1"/>
+              <w:bottom w:val="single" w:color="E0E0E0" w:sz="1"/>
+              <w:right w:val="single" w:color="E0E0E0" w:sz="1"/>
+            </w:tcBorders>
+            <w:tcMar>
+              <w:top w:type="dxa" w:w="80"/>
+              <w:left w:type="dxa" w:w="120"/>
+              <w:bottom w:type="dxa" w:w="80"/>
+              <w:right w:type="dxa" w:w="120"/>
+            </w:tcMar>
+          </w:tcPr>
+          <w:p>
+            <w:r>
+              <w:rPr>
+                <w:rFonts w:ascii="Arial" w:cs="Arial" w:eastAsia="Arial" w:hAnsi="Arial"/>
+                <w:color w:val="212121"/>
+                <w:sz w:val="20"/>
+                <w:szCs w:val="20"/>
+              </w:rPr>
+              <w:t xml:space="preserve">Panel web y generación del documento de confirmación</w:t>
+            </w:r>
+          </w:p>
+        </w:tc>
+        <w:tc>
+          <w:tcPr>
+            <w:tcW w:type="dxa" w:w="1700"/>
+            <w:tcBorders>
+              <w:top w:val="single" w:color="E0E0E0" w:sz="1"/>
+              <w:left w:val="single" w:color="E0E0E0" w:sz="1"/>
+              <w:bottom w:val="single" w:color="E0E0E0" w:sz="1"/>
+              <w:right w:val="single" w:color="E0E0E0" w:sz="1"/>
+            </w:tcBorders>
+            <w:tcMar>
+              <w:top w:type="dxa" w:w="80"/>
+              <w:left w:type="dxa" w:w="120"/>
+              <w:bottom w:type="dxa" w:w="80"/>
+              <w:right w:type="dxa" w:w="120"/>
+            </w:tcMar>
+          </w:tcPr>
+          <w:p>
+            <w:r>
+              <w:rPr>
+                <w:rFonts w:ascii="Arial" w:cs="Arial" w:eastAsia="Arial" w:hAnsi="Arial"/>
+                <w:color w:val="212121"/>
+                <w:sz w:val="20"/>
+                <w:szCs w:val="20"/>
+              </w:rPr>
+              <w:t xml:space="preserve">Proyecto conectado al GitHub de De Paseo en Fincas</w:t>
+            </w:r>
+          </w:p>
+        </w:tc>
+        <w:tc>
+          <w:tcPr>
+            <w:tcW w:type="dxa" w:w="2560"/>
+            <w:tcBorders>
+              <w:top w:val="single" w:color="E0E0E0" w:sz="1"/>
+              <w:left w:val="single" w:color="E0E0E0" w:sz="1"/>
+              <w:bottom w:val="single" w:color="E0E0E0" w:sz="1"/>
+              <w:right w:val="single" w:color="E0E0E0" w:sz="1"/>
+            </w:tcBorders>
+            <w:tcMar>
+              <w:top w:type="dxa" w:w="80"/>
+              <w:left w:type="dxa" w:w="120"/>
+              <w:bottom w:type="dxa" w:w="80"/>
+              <w:right w:type="dxa" w:w="120"/>
+            </w:tcMar>
+          </w:tcPr>
+          <w:p>
+            <w:r>
+              <w:rPr>
+                <w:rFonts w:ascii="Arial" w:cs="Arial" w:eastAsia="Arial" w:hAnsi="Arial"/>
+                <w:color w:val="212121"/>
+                <w:sz w:val="20"/>
+                <w:szCs w:val="20"/>
+              </w:rPr>
+              <w:t xml:space="preserve">Mantener el proyecto activo; si Vercel exige plan Pro por uso comercial, ponerle tarjeta (sección 2.6)</w:t>
+            </w:r>
+          </w:p>
+        </w:tc>
+        <w:tc>
+          <w:tcPr>
+            <w:tcW w:type="dxa" w:w="1100"/>
+            <w:tcBorders>
+              <w:top w:val="single" w:color="E0E0E0" w:sz="1"/>
+              <w:left w:val="single" w:color="E0E0E0" w:sz="1"/>
+              <w:bottom w:val="single" w:color="E0E0E0" w:sz="1"/>
+              <w:right w:val="single" w:color="E0E0E0" w:sz="1"/>
+            </w:tcBorders>
+            <w:tcMar>
+              <w:top w:type="dxa" w:w="80"/>
+              <w:left w:type="dxa" w:w="120"/>
+              <w:bottom w:type="dxa" w:w="80"/>
+              <w:right w:type="dxa" w:w="120"/>
+            </w:tcMar>
+          </w:tcPr>
+          <w:p>
+            <w:r>
+              <w:rPr>
+                <w:rFonts w:ascii="Arial" w:cs="Arial" w:eastAsia="Arial" w:hAnsi="Arial"/>
+                <w:color w:val="212121"/>
+                <w:sz w:val="20"/>
+                <w:szCs w:val="20"/>
+              </w:rPr>
+              <w:t xml:space="preserve">US$0 (Hobby) o US$20/mes (Pro)</w:t>
+            </w:r>
+          </w:p>
+        </w:tc>
+      </w:tr>
+      <w:tr>
+        <w:tc>
+          <w:tcPr>
+            <w:tcW w:type="dxa" w:w="1900"/>
+            <w:tcBorders>
+              <w:top w:val="single" w:color="E0E0E0" w:sz="1"/>
+              <w:left w:val="single" w:color="E0E0E0" w:sz="1"/>
+              <w:bottom w:val="single" w:color="E0E0E0" w:sz="1"/>
+              <w:right w:val="single" w:color="E0E0E0" w:sz="1"/>
+            </w:tcBorders>
+            <w:tcMar>
+              <w:top w:type="dxa" w:w="80"/>
+              <w:left w:type="dxa" w:w="120"/>
+              <w:bottom w:type="dxa" w:w="80"/>
+              <w:right w:type="dxa" w:w="120"/>
+            </w:tcMar>
+          </w:tcPr>
+          <w:p>
+            <w:r>
+              <w:rPr>
+                <w:rFonts w:ascii="Arial" w:cs="Arial" w:eastAsia="Arial" w:hAnsi="Arial"/>
+                <w:color w:val="212121"/>
+                <w:sz w:val="20"/>
+                <w:szCs w:val="20"/>
+              </w:rPr>
+              <w:t xml:space="preserve">Google Sheets / Drive</w:t>
+            </w:r>
+          </w:p>
+        </w:tc>
+        <w:tc>
+          <w:tcPr>
+            <w:tcW w:type="dxa" w:w="2100"/>
+            <w:tcBorders>
+              <w:top w:val="single" w:color="E0E0E0" w:sz="1"/>
+              <w:left w:val="single" w:color="E0E0E0" w:sz="1"/>
+              <w:bottom w:val="single" w:color="E0E0E0" w:sz="1"/>
+              <w:right w:val="single" w:color="E0E0E0" w:sz="1"/>
+            </w:tcBorders>
+            <w:tcMar>
+              <w:top w:type="dxa" w:w="80"/>
+              <w:left w:type="dxa" w:w="120"/>
+              <w:bottom w:type="dxa" w:w="80"/>
+              <w:right w:type="dxa" w:w="120"/>
+            </w:tcMar>
+          </w:tcPr>
+          <w:p>
+            <w:r>
+              <w:rPr>
+                <w:rFonts w:ascii="Arial" w:cs="Arial" w:eastAsia="Arial" w:hAnsi="Arial"/>
+                <w:color w:val="212121"/>
+                <w:sz w:val="20"/>
+                <w:szCs w:val="20"/>
+              </w:rPr>
+              <w:t xml:space="preserve">Inventario de fincas y fotos</w:t>
+            </w:r>
+          </w:p>
+        </w:tc>
+        <w:tc>
+          <w:tcPr>
+            <w:tcW w:type="dxa" w:w="1700"/>
+            <w:tcBorders>
+              <w:top w:val="single" w:color="E0E0E0" w:sz="1"/>
+              <w:left w:val="single" w:color="E0E0E0" w:sz="1"/>
+              <w:bottom w:val="single" w:color="E0E0E0" w:sz="1"/>
+              <w:right w:val="single" w:color="E0E0E0" w:sz="1"/>
+            </w:tcBorders>
+            <w:tcMar>
+              <w:top w:type="dxa" w:w="80"/>
+              <w:left w:type="dxa" w:w="120"/>
+              <w:bottom w:type="dxa" w:w="80"/>
+              <w:right w:type="dxa" w:w="120"/>
+            </w:tcMar>
+          </w:tcPr>
+          <w:p>
+            <w:r>
+              <w:rPr>
+                <w:rFonts w:ascii="Arial" w:cs="Arial" w:eastAsia="Arial" w:hAnsi="Arial"/>
+                <w:color w:val="212121"/>
+                <w:sz w:val="20"/>
+                <w:szCs w:val="20"/>
+              </w:rPr>
+              <w:t xml:space="preserve">Cuenta Google de De Paseo en Fincas</w:t>
+            </w:r>
+          </w:p>
+        </w:tc>
+        <w:tc>
+          <w:tcPr>
+            <w:tcW w:type="dxa" w:w="2560"/>
+            <w:tcBorders>
+              <w:top w:val="single" w:color="E0E0E0" w:sz="1"/>
+              <w:left w:val="single" w:color="E0E0E0" w:sz="1"/>
+              <w:bottom w:val="single" w:color="E0E0E0" w:sz="1"/>
+              <w:right w:val="single" w:color="E0E0E0" w:sz="1"/>
+            </w:tcBorders>
+            <w:tcMar>
+              <w:top w:type="dxa" w:w="80"/>
+              <w:left w:type="dxa" w:w="120"/>
+              <w:bottom w:type="dxa" w:w="80"/>
+              <w:right w:type="dxa" w:w="120"/>
+            </w:tcMar>
+          </w:tcPr>
+          <w:p>
+            <w:r>
+              <w:rPr>
+                <w:rFonts w:ascii="Arial" w:cs="Arial" w:eastAsia="Arial" w:hAnsi="Arial"/>
+                <w:color w:val="212121"/>
+                <w:sz w:val="20"/>
+                <w:szCs w:val="20"/>
+              </w:rPr>
+              <w:t xml:space="preserve">Nada; mantener el archivo al día</w:t>
+            </w:r>
+          </w:p>
+        </w:tc>
+        <w:tc>
+          <w:tcPr>
+            <w:tcW w:type="dxa" w:w="1100"/>
+            <w:tcBorders>
+              <w:top w:val="single" w:color="E0E0E0" w:sz="1"/>
+              <w:left w:val="single" w:color="E0E0E0" w:sz="1"/>
+              <w:bottom w:val="single" w:color="E0E0E0" w:sz="1"/>
+              <w:right w:val="single" w:color="E0E0E0" w:sz="1"/>
+            </w:tcBorders>
+            <w:tcMar>
+              <w:top w:type="dxa" w:w="80"/>
+              <w:left w:type="dxa" w:w="120"/>
+              <w:bottom w:type="dxa" w:w="80"/>
+              <w:right w:type="dxa" w:w="120"/>
+            </w:tcMar>
+          </w:tcPr>
+          <w:p>
+            <w:r>
+              <w:rPr>
+                <w:rFonts w:ascii="Arial" w:cs="Arial" w:eastAsia="Arial" w:hAnsi="Arial"/>
+                <w:color w:val="212121"/>
+                <w:sz w:val="20"/>
+                <w:szCs w:val="20"/>
+              </w:rPr>
+              <w:t xml:space="preserve">US$0</w:t>
+            </w:r>
+          </w:p>
+        </w:tc>
+      </w:tr>
+      <w:tr>
+        <w:tc>
+          <w:tcPr>
+            <w:tcW w:type="dxa" w:w="1900"/>
+            <w:tcBorders>
+              <w:top w:val="single" w:color="E0E0E0" w:sz="1"/>
+              <w:left w:val="single" w:color="E0E0E0" w:sz="1"/>
+              <w:bottom w:val="single" w:color="E0E0E0" w:sz="1"/>
+              <w:right w:val="single" w:color="E0E0E0" w:sz="1"/>
+            </w:tcBorders>
+            <w:tcMar>
+              <w:top w:type="dxa" w:w="80"/>
+              <w:left w:type="dxa" w:w="120"/>
+              <w:bottom w:type="dxa" w:w="80"/>
+              <w:right w:type="dxa" w:w="120"/>
+            </w:tcMar>
+          </w:tcPr>
+          <w:p>
+            <w:r>
+              <w:rPr>
+                <w:rFonts w:ascii="Arial" w:cs="Arial" w:eastAsia="Arial" w:hAnsi="Arial"/>
+                <w:color w:val="212121"/>
+                <w:sz w:val="20"/>
+                <w:szCs w:val="20"/>
+              </w:rPr>
+              <w:t xml:space="preserve">Dominio raaamp.co</w:t>
+            </w:r>
+          </w:p>
+        </w:tc>
+        <w:tc>
+          <w:tcPr>
+            <w:tcW w:type="dxa" w:w="2100"/>
+            <w:tcBorders>
+              <w:top w:val="single" w:color="E0E0E0" w:sz="1"/>
+              <w:left w:val="single" w:color="E0E0E0" w:sz="1"/>
+              <w:bottom w:val="single" w:color="E0E0E0" w:sz="1"/>
+              <w:right w:val="single" w:color="E0E0E0" w:sz="1"/>
+            </w:tcBorders>
+            <w:tcMar>
+              <w:top w:type="dxa" w:w="80"/>
+              <w:left w:type="dxa" w:w="120"/>
+              <w:bottom w:type="dxa" w:w="80"/>
+              <w:right w:type="dxa" w:w="120"/>
+            </w:tcMar>
+          </w:tcPr>
+          <w:p>
+            <w:r>
+              <w:rPr>
+                <w:rFonts w:ascii="Arial" w:cs="Arial" w:eastAsia="Arial" w:hAnsi="Arial"/>
+                <w:color w:val="212121"/>
+                <w:sz w:val="20"/>
+                <w:szCs w:val="20"/>
+              </w:rPr>
+              <w:t xml:space="preserve">Direcciones n8n.depaseoenfincas.raaamp.co y chat.depaseoenfincas.raaamp.co</w:t>
+            </w:r>
+          </w:p>
+        </w:tc>
+        <w:tc>
+          <w:tcPr>
+            <w:tcW w:type="dxa" w:w="1700"/>
+            <w:tcBorders>
+              <w:top w:val="single" w:color="E0E0E0" w:sz="1"/>
+              <w:left w:val="single" w:color="E0E0E0" w:sz="1"/>
+              <w:bottom w:val="single" w:color="E0E0E0" w:sz="1"/>
+              <w:right w:val="single" w:color="E0E0E0" w:sz="1"/>
+            </w:tcBorders>
+            <w:tcMar>
+              <w:top w:type="dxa" w:w="80"/>
+              <w:left w:type="dxa" w:w="120"/>
+              <w:bottom w:type="dxa" w:w="80"/>
+              <w:right w:type="dxa" w:w="120"/>
+            </w:tcMar>
+          </w:tcPr>
+          <w:p>
+            <w:r>
+              <w:rPr>
+                <w:rFonts w:ascii="Arial" w:cs="Arial" w:eastAsia="Arial" w:hAnsi="Arial"/>
+                <w:color w:val="212121"/>
+                <w:sz w:val="20"/>
+                <w:szCs w:val="20"/>
+              </w:rPr>
+              <w:t xml:space="preserve">Dominio de raaamp</w:t>
+            </w:r>
+          </w:p>
+        </w:tc>
+        <w:tc>
+          <w:tcPr>
+            <w:tcW w:type="dxa" w:w="2560"/>
+            <w:tcBorders>
+              <w:top w:val="single" w:color="E0E0E0" w:sz="1"/>
+              <w:left w:val="single" w:color="E0E0E0" w:sz="1"/>
+              <w:bottom w:val="single" w:color="E0E0E0" w:sz="1"/>
+              <w:right w:val="single" w:color="E0E0E0" w:sz="1"/>
+            </w:tcBorders>
+            <w:tcMar>
+              <w:top w:type="dxa" w:w="80"/>
+              <w:left w:type="dxa" w:w="120"/>
+              <w:bottom w:type="dxa" w:w="80"/>
+              <w:right w:type="dxa" w:w="120"/>
+            </w:tcMar>
+          </w:tcPr>
+          <w:p>
+            <w:r>
+              <w:rPr>
+                <w:rFonts w:ascii="Arial" w:cs="Arial" w:eastAsia="Arial" w:hAnsi="Arial"/>
+                <w:color w:val="212121"/>
+                <w:sz w:val="20"/>
+                <w:szCs w:val="20"/>
+              </w:rPr>
+              <w:t xml:space="preserve">Opcional: mover a subdominios de depaseoenfincas.com (raaamp configura DNS)</w:t>
+            </w:r>
+          </w:p>
+        </w:tc>
+        <w:tc>
+          <w:tcPr>
+            <w:tcW w:type="dxa" w:w="1100"/>
+            <w:tcBorders>
+              <w:top w:val="single" w:color="E0E0E0" w:sz="1"/>
+              <w:left w:val="single" w:color="E0E0E0" w:sz="1"/>
+              <w:bottom w:val="single" w:color="E0E0E0" w:sz="1"/>
+              <w:right w:val="single" w:color="E0E0E0" w:sz="1"/>
+            </w:tcBorders>
+            <w:tcMar>
+              <w:top w:type="dxa" w:w="80"/>
+              <w:left w:type="dxa" w:w="120"/>
+              <w:bottom w:type="dxa" w:w="80"/>
+              <w:right w:type="dxa" w:w="120"/>
+            </w:tcMar>
+          </w:tcPr>
+          <w:p>
+            <w:r>
+              <w:rPr>
+                <w:rFonts w:ascii="Arial" w:cs="Arial" w:eastAsia="Arial" w:hAnsi="Arial"/>
+                <w:color w:val="212121"/>
+                <w:sz w:val="20"/>
+                <w:szCs w:val="20"/>
+              </w:rPr>
+              <w:t xml:space="preserve">US$0</w:t>
+            </w:r>
+          </w:p>
+        </w:tc>
+      </w:tr>
+    </w:tbl>
+    <w:p>
+      <w:pPr>
+        <w:spacing w:after="0" w:before="100"/>
+      </w:pPr>
+    </w:p>
+    <w:p>
+      <w:pPr>
+        <w:spacing w:after="120" w:before="0"/>
+      </w:pPr>
+      <w:r>
+        <w:rPr>
+          <w:rFonts w:ascii="Arial" w:cs="Arial" w:eastAsia="Arial" w:hAnsi="Arial"/>
+          <w:color w:val="616161"/>
+          <w:sz w:val="20"/>
+          <w:szCs w:val="20"/>
+        </w:rPr>
+        <w:t xml:space="preserve">Las cifras son estimaciones con el tráfico de hoy (163 mensajes de WhatsApp en el mes) y deben verificarse en cada proveedor. Ninguno de estos servicios se paga a raaamp salvo el servidor si se elige la opción A.</w:t>
+      </w:r>
+    </w:p>
+    <w:p>
+      <w:r>
+        <w:br w:type="page"/>
+      </w:r>
+    </w:p>
+    <w:p>
+      <w:pPr>
+        <w:pStyle w:val="Heading1"/>
+      </w:pPr>
+      <w:r>
+        <w:t xml:space="preserve">2. Paso a paso para poner la tarjeta en cada servicio</w:t>
+      </w:r>
+    </w:p>
+    <w:p>
+      <w:pPr>
+        <w:spacing w:after="120" w:before="0"/>
+      </w:pPr>
+      <w:r>
+        <w:rPr>
+          <w:rFonts w:ascii="Arial" w:cs="Arial" w:eastAsia="Arial" w:hAnsi="Arial"/>
+          <w:color w:val="212121"/>
+          <w:sz w:val="22"/>
+          <w:szCs w:val="22"/>
+        </w:rPr>
+        <w:t xml:space="preserve">Guía para el administrador de De Paseo en Fincas. En los servicios que hoy están a nombre de raaamp, el paso final es enviar la clave o el acceso a raaamp para que lo instale; nada se apaga durante el cambio.</w:t>
+      </w:r>
+    </w:p>
     <w:p>
       <w:pPr>
         <w:pStyle w:val="Heading2"/>
       </w:pPr>
       <w:r>
-        <w:t xml:space="preserve">Dónde agregar el método de pago</w:t>
+        <w:t xml:space="preserve">2.1 Meta · WhatsApp Business (urgente)</w:t>
       </w:r>
     </w:p>
     <w:p>
@@ -569,15 +2070,661 @@
     </w:p>
     <w:p>
       <w:pPr>
+        <w:spacing w:after="120" w:before="80"/>
+      </w:pPr>
+      <w:r>
+        <w:rPr>
+          <w:rFonts w:ascii="Arial" w:cs="Arial" w:eastAsia="Arial" w:hAnsi="Arial"/>
+          <w:color w:val="212121"/>
+          <w:sz w:val="22"/>
+          <w:szCs w:val="22"/>
+        </w:rPr>
+        <w:t xml:space="preserve">Ruta alternativa: </w:t>
+      </w:r>
+      <w:r>
+        <w:rPr>
+          <w:rFonts w:ascii="Arial" w:cs="Arial" w:eastAsia="Arial" w:hAnsi="Arial"/>
+          <w:b/>
+          <w:bCs/>
+          <w:color w:val="212121"/>
+          <w:sz w:val="22"/>
+          <w:szCs w:val="22"/>
+        </w:rPr>
+        <w:t xml:space="preserve">Configuración del negocio → Facturación y pagos → Métodos de pago</w:t>
+      </w:r>
+      <w:r>
+        <w:rPr>
+          <w:rFonts w:ascii="Arial" w:cs="Arial" w:eastAsia="Arial" w:hAnsi="Arial"/>
+          <w:color w:val="212121"/>
+          <w:sz w:val="22"/>
+          <w:szCs w:val="22"/>
+        </w:rPr>
+        <w:t xml:space="preserve"> (business.facebook.com/billing_hub).</w:t>
+      </w:r>
+    </w:p>
+    <w:p>
+      <w:pPr>
+        <w:spacing w:after="120" w:before="0"/>
+      </w:pPr>
+      <w:r>
+        <w:rPr>
+          <w:rFonts w:ascii="Arial" w:cs="Arial" w:eastAsia="Arial" w:hAnsi="Arial"/>
+          <w:b/>
+          <w:bCs/>
+          <w:color w:val="212121"/>
+          <w:sz w:val="22"/>
+          <w:szCs w:val="22"/>
+        </w:rPr>
+        <w:t xml:space="preserve">Líneas de la cuenta: </w:t>
+      </w:r>
+      <w:r>
+        <w:rPr>
+          <w:rFonts w:ascii="Arial" w:cs="Arial" w:eastAsia="Arial" w:hAnsi="Arial"/>
+          <w:color w:val="212121"/>
+          <w:sz w:val="22"/>
+          <w:szCs w:val="22"/>
+        </w:rPr>
+        <w:t xml:space="preserve">la que atiende a los clientes es </w:t>
+      </w:r>
+      <w:r>
+        <w:rPr>
+          <w:rFonts w:ascii="Arial" w:cs="Arial" w:eastAsia="Arial" w:hAnsi="Arial"/>
+          <w:b/>
+          <w:bCs/>
+          <w:color w:val="212121"/>
+          <w:sz w:val="22"/>
+          <w:szCs w:val="22"/>
+        </w:rPr>
+        <w:t xml:space="preserve">+1 201-701-8810</w:t>
+      </w:r>
+      <w:r>
+        <w:rPr>
+          <w:rFonts w:ascii="Arial" w:cs="Arial" w:eastAsia="Arial" w:hAnsi="Arial"/>
+          <w:color w:val="212121"/>
+          <w:sz w:val="22"/>
+          <w:szCs w:val="22"/>
+        </w:rPr>
+        <w:t xml:space="preserve">. La línea +57 310 5639334 está en la misma cuenta y depende del mismo método de pago.</w:t>
+      </w:r>
+    </w:p>
+    <w:p>
+      <w:pPr>
+        <w:pStyle w:val="Heading2"/>
+      </w:pPr>
+      <w:r>
+        <w:t xml:space="preserve">2.2 Google Gemini (inteligencia artificial)</w:t>
+      </w:r>
+    </w:p>
+    <w:p>
+      <w:pPr>
+        <w:pStyle w:val="ListParagraph"/>
+        <w:numPr>
+          <w:ilvl w:val="0"/>
+          <w:numId w:val="3"/>
+        </w:numPr>
+        <w:spacing w:after="60"/>
+      </w:pPr>
+      <w:r>
+        <w:rPr>
+          <w:rFonts w:ascii="Arial" w:cs="Arial" w:eastAsia="Arial" w:hAnsi="Arial"/>
+          <w:color w:val="212121"/>
+          <w:sz w:val="20"/>
+          <w:szCs w:val="20"/>
+        </w:rPr>
+        <w:t xml:space="preserve">Con la cuenta de Google de la empresa entrar a </w:t>
+      </w:r>
+      <w:r>
+        <w:rPr>
+          <w:rFonts w:ascii="Arial" w:cs="Arial" w:eastAsia="Arial" w:hAnsi="Arial"/>
+          <w:b/>
+          <w:bCs/>
+          <w:color w:val="212121"/>
+          <w:sz w:val="20"/>
+          <w:szCs w:val="20"/>
+        </w:rPr>
+        <w:t xml:space="preserve">aistudio.google.com/apikey</w:t>
+      </w:r>
+      <w:r>
+        <w:rPr>
+          <w:rFonts w:ascii="Arial" w:cs="Arial" w:eastAsia="Arial" w:hAnsi="Arial"/>
+          <w:color w:val="212121"/>
+          <w:sz w:val="20"/>
+          <w:szCs w:val="20"/>
+        </w:rPr>
+        <w:t xml:space="preserve"> y crear una clave de API ("Create API key") en un proyecto nuevo, por ejemplo "De Paseo en Fincas".</w:t>
+      </w:r>
+    </w:p>
+    <w:p>
+      <w:pPr>
+        <w:pStyle w:val="ListParagraph"/>
+        <w:numPr>
+          <w:ilvl w:val="0"/>
+          <w:numId w:val="3"/>
+        </w:numPr>
+        <w:spacing w:after="60"/>
+      </w:pPr>
+      <w:r>
+        <w:rPr>
+          <w:rFonts w:ascii="Arial" w:cs="Arial" w:eastAsia="Arial" w:hAnsi="Arial"/>
+          <w:color w:val="212121"/>
+          <w:sz w:val="20"/>
+          <w:szCs w:val="20"/>
+        </w:rPr>
+        <w:t xml:space="preserve">Activar facturación en </w:t>
+      </w:r>
+      <w:r>
+        <w:rPr>
+          <w:rFonts w:ascii="Arial" w:cs="Arial" w:eastAsia="Arial" w:hAnsi="Arial"/>
+          <w:b/>
+          <w:bCs/>
+          <w:color w:val="212121"/>
+          <w:sz w:val="20"/>
+          <w:szCs w:val="20"/>
+        </w:rPr>
+        <w:t xml:space="preserve">console.cloud.google.com/billing</w:t>
+      </w:r>
+      <w:r>
+        <w:rPr>
+          <w:rFonts w:ascii="Arial" w:cs="Arial" w:eastAsia="Arial" w:hAnsi="Arial"/>
+          <w:color w:val="212121"/>
+          <w:sz w:val="20"/>
+          <w:szCs w:val="20"/>
+        </w:rPr>
+        <w:t xml:space="preserve">: crear una cuenta de facturación con la tarjeta de la empresa y asociarla al proyecto. Sin facturación la clave queda en el nivel gratuito, con límites que el asistente supera en horas de tráfico.</w:t>
+      </w:r>
+    </w:p>
+    <w:p>
+      <w:pPr>
+        <w:pStyle w:val="ListParagraph"/>
+        <w:numPr>
+          <w:ilvl w:val="0"/>
+          <w:numId w:val="3"/>
+        </w:numPr>
+        <w:spacing w:after="60"/>
+      </w:pPr>
+      <w:r>
+        <w:rPr>
+          <w:rFonts w:ascii="Arial" w:cs="Arial" w:eastAsia="Arial" w:hAnsi="Arial"/>
+          <w:color w:val="212121"/>
+          <w:sz w:val="20"/>
+          <w:szCs w:val="20"/>
+        </w:rPr>
+        <w:t xml:space="preserve">Enviar la clave a raaamp por un canal seguro (no por WhatsApp del cliente). raaamp la reemplaza en n8n y verifica con la suite de pruebas.</w:t>
+      </w:r>
+    </w:p>
+    <w:p>
+      <w:pPr>
+        <w:pStyle w:val="ListParagraph"/>
+        <w:numPr>
+          <w:ilvl w:val="0"/>
+          <w:numId w:val="3"/>
+        </w:numPr>
+        <w:spacing w:after="60"/>
+      </w:pPr>
+      <w:r>
+        <w:rPr>
+          <w:rFonts w:ascii="Arial" w:cs="Arial" w:eastAsia="Arial" w:hAnsi="Arial"/>
+          <w:color w:val="212121"/>
+          <w:sz w:val="20"/>
+          <w:szCs w:val="20"/>
+        </w:rPr>
+        <w:t xml:space="preserve">Opcional: en </w:t>
+      </w:r>
+      <w:r>
+        <w:rPr>
+          <w:rFonts w:ascii="Arial" w:cs="Arial" w:eastAsia="Arial" w:hAnsi="Arial"/>
+          <w:b/>
+          <w:bCs/>
+          <w:color w:val="212121"/>
+          <w:sz w:val="20"/>
+          <w:szCs w:val="20"/>
+        </w:rPr>
+        <w:t xml:space="preserve">console.cloud.google.com/billing → Presupuestos y alertas</w:t>
+      </w:r>
+      <w:r>
+        <w:rPr>
+          <w:rFonts w:ascii="Arial" w:cs="Arial" w:eastAsia="Arial" w:hAnsi="Arial"/>
+          <w:color w:val="212121"/>
+          <w:sz w:val="20"/>
+          <w:szCs w:val="20"/>
+        </w:rPr>
+        <w:t xml:space="preserve"> poner un presupuesto mensual (por ejemplo US$50) para recibir aviso por correo.</w:t>
+      </w:r>
+    </w:p>
+    <w:p>
+      <w:pPr>
+        <w:pStyle w:val="Heading2"/>
+      </w:pPr>
+      <w:r>
+        <w:t xml:space="preserve">2.3 OpenAI (transcripción de audios)</w:t>
+      </w:r>
+    </w:p>
+    <w:p>
+      <w:pPr>
+        <w:pStyle w:val="ListParagraph"/>
+        <w:numPr>
+          <w:ilvl w:val="0"/>
+          <w:numId w:val="4"/>
+        </w:numPr>
+        <w:spacing w:after="60"/>
+      </w:pPr>
+      <w:r>
+        <w:rPr>
+          <w:rFonts w:ascii="Arial" w:cs="Arial" w:eastAsia="Arial" w:hAnsi="Arial"/>
+          <w:color w:val="212121"/>
+          <w:sz w:val="20"/>
+          <w:szCs w:val="20"/>
+        </w:rPr>
+        <w:t xml:space="preserve">Crear cuenta en </w:t>
+      </w:r>
+      <w:r>
+        <w:rPr>
+          <w:rFonts w:ascii="Arial" w:cs="Arial" w:eastAsia="Arial" w:hAnsi="Arial"/>
+          <w:b/>
+          <w:bCs/>
+          <w:color w:val="212121"/>
+          <w:sz w:val="20"/>
+          <w:szCs w:val="20"/>
+        </w:rPr>
+        <w:t xml:space="preserve">platform.openai.com</w:t>
+      </w:r>
+      <w:r>
+        <w:rPr>
+          <w:rFonts w:ascii="Arial" w:cs="Arial" w:eastAsia="Arial" w:hAnsi="Arial"/>
+          <w:color w:val="212121"/>
+          <w:sz w:val="20"/>
+          <w:szCs w:val="20"/>
+        </w:rPr>
+        <w:t xml:space="preserve"> con el correo de la empresa.</w:t>
+      </w:r>
+    </w:p>
+    <w:p>
+      <w:pPr>
+        <w:pStyle w:val="ListParagraph"/>
+        <w:numPr>
+          <w:ilvl w:val="0"/>
+          <w:numId w:val="4"/>
+        </w:numPr>
+        <w:spacing w:after="60"/>
+      </w:pPr>
+      <w:r>
+        <w:rPr>
+          <w:rFonts w:ascii="Arial" w:cs="Arial" w:eastAsia="Arial" w:hAnsi="Arial"/>
+          <w:color w:val="212121"/>
+          <w:sz w:val="20"/>
+          <w:szCs w:val="20"/>
+        </w:rPr>
+        <w:t xml:space="preserve">En </w:t>
+      </w:r>
+      <w:r>
+        <w:rPr>
+          <w:rFonts w:ascii="Arial" w:cs="Arial" w:eastAsia="Arial" w:hAnsi="Arial"/>
+          <w:b/>
+          <w:bCs/>
+          <w:color w:val="212121"/>
+          <w:sz w:val="20"/>
+          <w:szCs w:val="20"/>
+        </w:rPr>
+        <w:t xml:space="preserve">Settings → Billing → Payment methods</w:t>
+      </w:r>
+      <w:r>
+        <w:rPr>
+          <w:rFonts w:ascii="Arial" w:cs="Arial" w:eastAsia="Arial" w:hAnsi="Arial"/>
+          <w:color w:val="212121"/>
+          <w:sz w:val="20"/>
+          <w:szCs w:val="20"/>
+        </w:rPr>
+        <w:t xml:space="preserve"> agregar la tarjeta y cargar un saldo inicial (US$10 alcanza varios meses).</w:t>
+      </w:r>
+    </w:p>
+    <w:p>
+      <w:pPr>
+        <w:pStyle w:val="ListParagraph"/>
+        <w:numPr>
+          <w:ilvl w:val="0"/>
+          <w:numId w:val="4"/>
+        </w:numPr>
+        <w:spacing w:after="60"/>
+      </w:pPr>
+      <w:r>
+        <w:rPr>
+          <w:rFonts w:ascii="Arial" w:cs="Arial" w:eastAsia="Arial" w:hAnsi="Arial"/>
+          <w:color w:val="212121"/>
+          <w:sz w:val="20"/>
+          <w:szCs w:val="20"/>
+        </w:rPr>
+        <w:t xml:space="preserve">En </w:t>
+      </w:r>
+      <w:r>
+        <w:rPr>
+          <w:rFonts w:ascii="Arial" w:cs="Arial" w:eastAsia="Arial" w:hAnsi="Arial"/>
+          <w:b/>
+          <w:bCs/>
+          <w:color w:val="212121"/>
+          <w:sz w:val="20"/>
+          <w:szCs w:val="20"/>
+        </w:rPr>
+        <w:t xml:space="preserve">API keys → Create new secret key</w:t>
+      </w:r>
+      <w:r>
+        <w:rPr>
+          <w:rFonts w:ascii="Arial" w:cs="Arial" w:eastAsia="Arial" w:hAnsi="Arial"/>
+          <w:color w:val="212121"/>
+          <w:sz w:val="20"/>
+          <w:szCs w:val="20"/>
+        </w:rPr>
+        <w:t xml:space="preserve"> generar la clave y enviarla a raaamp por un canal seguro; raaamp la instala en n8n.</w:t>
+      </w:r>
+    </w:p>
+    <w:p>
+      <w:pPr>
+        <w:pStyle w:val="Heading2"/>
+      </w:pPr>
+      <w:r>
+        <w:t xml:space="preserve">2.4 Servidor Hetzner (n8n + Chatwoot)</w:t>
+      </w:r>
+    </w:p>
+    <w:p>
+      <w:pPr>
+        <w:spacing w:after="120" w:before="0"/>
+      </w:pPr>
+      <w:r>
+        <w:rPr>
+          <w:rFonts w:ascii="Arial" w:cs="Arial" w:eastAsia="Arial" w:hAnsi="Arial"/>
+          <w:b/>
+          <w:bCs/>
+          <w:color w:val="212121"/>
+          <w:sz w:val="22"/>
+          <w:szCs w:val="22"/>
+        </w:rPr>
+        <w:t xml:space="preserve">Opción A (más simple): </w:t>
+      </w:r>
+      <w:r>
+        <w:rPr>
+          <w:rFonts w:ascii="Arial" w:cs="Arial" w:eastAsia="Arial" w:hAnsi="Arial"/>
+          <w:color w:val="212121"/>
+          <w:sz w:val="22"/>
+          <w:szCs w:val="22"/>
+        </w:rPr>
+        <w:t xml:space="preserve">raaamp mantiene el servidor a su nombre y lo factura mensualmente a De Paseo en Fincas. No hay que hacer nada más.</w:t>
+      </w:r>
+    </w:p>
+    <w:p>
+      <w:pPr>
+        <w:spacing w:after="120" w:before="0"/>
+      </w:pPr>
+      <w:r>
+        <w:rPr>
+          <w:rFonts w:ascii="Arial" w:cs="Arial" w:eastAsia="Arial" w:hAnsi="Arial"/>
+          <w:b/>
+          <w:bCs/>
+          <w:color w:val="212121"/>
+          <w:sz w:val="22"/>
+          <w:szCs w:val="22"/>
+        </w:rPr>
+        <w:t xml:space="preserve">Opción B (a nombre del cliente):</w:t>
+      </w:r>
+    </w:p>
+    <w:p>
+      <w:pPr>
+        <w:pStyle w:val="ListParagraph"/>
+        <w:numPr>
+          <w:ilvl w:val="0"/>
+          <w:numId w:val="5"/>
+        </w:numPr>
+        <w:spacing w:after="60"/>
+      </w:pPr>
+      <w:r>
+        <w:rPr>
+          <w:rFonts w:ascii="Arial" w:cs="Arial" w:eastAsia="Arial" w:hAnsi="Arial"/>
+          <w:color w:val="212121"/>
+          <w:sz w:val="20"/>
+          <w:szCs w:val="20"/>
+        </w:rPr>
+        <w:t xml:space="preserve">Crear cuenta en </w:t>
+      </w:r>
+      <w:r>
+        <w:rPr>
+          <w:rFonts w:ascii="Arial" w:cs="Arial" w:eastAsia="Arial" w:hAnsi="Arial"/>
+          <w:b/>
+          <w:bCs/>
+          <w:color w:val="212121"/>
+          <w:sz w:val="20"/>
+          <w:szCs w:val="20"/>
+        </w:rPr>
+        <w:t xml:space="preserve">accounts.hetzner.com</w:t>
+      </w:r>
+      <w:r>
+        <w:rPr>
+          <w:rFonts w:ascii="Arial" w:cs="Arial" w:eastAsia="Arial" w:hAnsi="Arial"/>
+          <w:color w:val="212121"/>
+          <w:sz w:val="20"/>
+          <w:szCs w:val="20"/>
+        </w:rPr>
+        <w:t xml:space="preserve"> con los datos de la empresa y poner la tarjeta en </w:t>
+      </w:r>
+      <w:r>
+        <w:rPr>
+          <w:rFonts w:ascii="Arial" w:cs="Arial" w:eastAsia="Arial" w:hAnsi="Arial"/>
+          <w:b/>
+          <w:bCs/>
+          <w:color w:val="212121"/>
+          <w:sz w:val="20"/>
+          <w:szCs w:val="20"/>
+        </w:rPr>
+        <w:t xml:space="preserve">Payment methods</w:t>
+      </w:r>
+      <w:r>
+        <w:rPr>
+          <w:rFonts w:ascii="Arial" w:cs="Arial" w:eastAsia="Arial" w:hAnsi="Arial"/>
+          <w:color w:val="212121"/>
+          <w:sz w:val="20"/>
+          <w:szCs w:val="20"/>
+        </w:rPr>
+        <w:t xml:space="preserve">.</w:t>
+      </w:r>
+    </w:p>
+    <w:p>
+      <w:pPr>
+        <w:pStyle w:val="ListParagraph"/>
+        <w:numPr>
+          <w:ilvl w:val="0"/>
+          <w:numId w:val="5"/>
+        </w:numPr>
+        <w:spacing w:after="60"/>
+      </w:pPr>
+      <w:r>
+        <w:rPr>
+          <w:rFonts w:ascii="Arial" w:cs="Arial" w:eastAsia="Arial" w:hAnsi="Arial"/>
+          <w:color w:val="212121"/>
+          <w:sz w:val="20"/>
+          <w:szCs w:val="20"/>
+        </w:rPr>
+        <w:t xml:space="preserve">Avisar a raaamp el correo de la cuenta. raaamp transfiere el proyecto de Hetzner Cloud (servidor e IP incluidos) a esa cuenta; el servicio no se interrumpe.</w:t>
+      </w:r>
+    </w:p>
+    <w:p>
+      <w:pPr>
+        <w:pStyle w:val="ListParagraph"/>
+        <w:numPr>
+          <w:ilvl w:val="0"/>
+          <w:numId w:val="5"/>
+        </w:numPr>
+        <w:spacing w:after="60"/>
+      </w:pPr>
+      <w:r>
+        <w:rPr>
+          <w:rFonts w:ascii="Arial" w:cs="Arial" w:eastAsia="Arial" w:hAnsi="Arial"/>
+          <w:color w:val="212121"/>
+          <w:sz w:val="20"/>
+          <w:szCs w:val="20"/>
+        </w:rPr>
+        <w:t xml:space="preserve">Desde ese momento la factura mensual llega a De Paseo en Fincas. raaamp conserva el acceso técnico para operar n8n y Chatwoot.</w:t>
+      </w:r>
+    </w:p>
+    <w:p>
+      <w:pPr>
+        <w:pStyle w:val="Heading2"/>
+      </w:pPr>
+      <w:r>
+        <w:t xml:space="preserve">2.5 Supabase (base de datos)</w:t>
+      </w:r>
+    </w:p>
+    <w:p>
+      <w:pPr>
+        <w:pStyle w:val="ListParagraph"/>
+        <w:numPr>
+          <w:ilvl w:val="0"/>
+          <w:numId w:val="6"/>
+        </w:numPr>
+        <w:spacing w:after="60"/>
+      </w:pPr>
+      <w:r>
+        <w:rPr>
+          <w:rFonts w:ascii="Arial" w:cs="Arial" w:eastAsia="Arial" w:hAnsi="Arial"/>
+          <w:color w:val="212121"/>
+          <w:sz w:val="20"/>
+          <w:szCs w:val="20"/>
+        </w:rPr>
+        <w:t xml:space="preserve">Crear cuenta en </w:t>
+      </w:r>
+      <w:r>
+        <w:rPr>
+          <w:rFonts w:ascii="Arial" w:cs="Arial" w:eastAsia="Arial" w:hAnsi="Arial"/>
+          <w:b/>
+          <w:bCs/>
+          <w:color w:val="212121"/>
+          <w:sz w:val="20"/>
+          <w:szCs w:val="20"/>
+        </w:rPr>
+        <w:t xml:space="preserve">supabase.com</w:t>
+      </w:r>
+      <w:r>
+        <w:rPr>
+          <w:rFonts w:ascii="Arial" w:cs="Arial" w:eastAsia="Arial" w:hAnsi="Arial"/>
+          <w:color w:val="212121"/>
+          <w:sz w:val="20"/>
+          <w:szCs w:val="20"/>
+        </w:rPr>
+        <w:t xml:space="preserve"> con el correo de la empresa y crear una organización "De Paseo en Fincas".</w:t>
+      </w:r>
+    </w:p>
+    <w:p>
+      <w:pPr>
+        <w:pStyle w:val="ListParagraph"/>
+        <w:numPr>
+          <w:ilvl w:val="0"/>
+          <w:numId w:val="6"/>
+        </w:numPr>
+        <w:spacing w:after="60"/>
+      </w:pPr>
+      <w:r>
+        <w:rPr>
+          <w:rFonts w:ascii="Arial" w:cs="Arial" w:eastAsia="Arial" w:hAnsi="Arial"/>
+          <w:color w:val="212121"/>
+          <w:sz w:val="20"/>
+          <w:szCs w:val="20"/>
+        </w:rPr>
+        <w:t xml:space="preserve">En </w:t>
+      </w:r>
+      <w:r>
+        <w:rPr>
+          <w:rFonts w:ascii="Arial" w:cs="Arial" w:eastAsia="Arial" w:hAnsi="Arial"/>
+          <w:b/>
+          <w:bCs/>
+          <w:color w:val="212121"/>
+          <w:sz w:val="20"/>
+          <w:szCs w:val="20"/>
+        </w:rPr>
+        <w:t xml:space="preserve">Organization settings → Billing</w:t>
+      </w:r>
+      <w:r>
+        <w:rPr>
+          <w:rFonts w:ascii="Arial" w:cs="Arial" w:eastAsia="Arial" w:hAnsi="Arial"/>
+          <w:color w:val="212121"/>
+          <w:sz w:val="20"/>
+          <w:szCs w:val="20"/>
+        </w:rPr>
+        <w:t xml:space="preserve"> elegir el plan Pro (US$25/mes) y agregar la tarjeta. Con el plan gratuito el proyecto se pausa tras una semana sin actividad y el asistente deja de responder hasta reactivarlo a mano (ya ocurrió en junio).</w:t>
+      </w:r>
+    </w:p>
+    <w:p>
+      <w:pPr>
+        <w:pStyle w:val="ListParagraph"/>
+        <w:numPr>
+          <w:ilvl w:val="0"/>
+          <w:numId w:val="6"/>
+        </w:numPr>
+        <w:spacing w:after="60"/>
+      </w:pPr>
+      <w:r>
+        <w:rPr>
+          <w:rFonts w:ascii="Arial" w:cs="Arial" w:eastAsia="Arial" w:hAnsi="Arial"/>
+          <w:color w:val="212121"/>
+          <w:sz w:val="20"/>
+          <w:szCs w:val="20"/>
+        </w:rPr>
+        <w:t xml:space="preserve">Avisar a raaamp: transfiere el proyecto actual (qoeigqytlyjnpvxacrht) a la organización nueva desde Project settings → General → Transfer project, sin pérdida de datos ni cambio de credenciales.</w:t>
+      </w:r>
+    </w:p>
+    <w:p>
+      <w:pPr>
+        <w:pStyle w:val="Heading2"/>
+      </w:pPr>
+      <w:r>
+        <w:t xml:space="preserve">2.6 Vercel (panel de administración)</w:t>
+      </w:r>
+    </w:p>
+    <w:p>
+      <w:pPr>
+        <w:pStyle w:val="ListParagraph"/>
+        <w:numPr>
+          <w:ilvl w:val="0"/>
+          <w:numId w:val="7"/>
+        </w:numPr>
+        <w:spacing w:after="60"/>
+      </w:pPr>
+      <w:r>
+        <w:rPr>
+          <w:rFonts w:ascii="Arial" w:cs="Arial" w:eastAsia="Arial" w:hAnsi="Arial"/>
+          <w:color w:val="212121"/>
+          <w:sz w:val="20"/>
+          <w:szCs w:val="20"/>
+        </w:rPr>
+        <w:t xml:space="preserve">El proyecto está conectado al GitHub de De Paseo en Fincas (organización depaseoenfincas06-maker). En </w:t>
+      </w:r>
+      <w:r>
+        <w:rPr>
+          <w:rFonts w:ascii="Arial" w:cs="Arial" w:eastAsia="Arial" w:hAnsi="Arial"/>
+          <w:b/>
+          <w:bCs/>
+          <w:color w:val="212121"/>
+          <w:sz w:val="20"/>
+          <w:szCs w:val="20"/>
+        </w:rPr>
+        <w:t xml:space="preserve">vercel.com → Settings → Billing</w:t>
+      </w:r>
+      <w:r>
+        <w:rPr>
+          <w:rFonts w:ascii="Arial" w:cs="Arial" w:eastAsia="Arial" w:hAnsi="Arial"/>
+          <w:color w:val="212121"/>
+          <w:sz w:val="20"/>
+          <w:szCs w:val="20"/>
+        </w:rPr>
+        <w:t xml:space="preserve"> se agrega la tarjeta solo si Vercel exige el plan Pro; el uso actual cabe en el plan gratuito.</w:t>
+      </w:r>
+    </w:p>
+    <w:p>
+      <w:pPr>
         <w:spacing w:after="0" w:before="120"/>
       </w:pPr>
     </w:p>
     <w:p>
       <w:pPr>
-        <w:pStyle w:val="Heading2"/>
-      </w:pPr>
-      <w:r>
-        <w:t xml:space="preserve">Checklist de operación</w:t>
+        <w:pStyle w:val="Heading1"/>
+      </w:pPr>
+      <w:r>
+        <w:t xml:space="preserve">3. Checklist de operación</w:t>
       </w:r>
     </w:p>
     <w:tbl>
@@ -773,7 +2920,7 @@
                 <w:sz w:val="20"/>
                 <w:szCs w:val="20"/>
               </w:rPr>
-              <w:t xml:space="preserve">WhatsApp Manager → Configuración de pagos (ver arriba)</w:t>
+              <w:t xml:space="preserve">WhatsApp Manager → Configuración de pagos (sección 2.1)</w:t>
             </w:r>
           </w:p>
         </w:tc>
@@ -1031,7 +3178,7 @@
                 <w:sz w:val="20"/>
                 <w:szCs w:val="20"/>
               </w:rPr>
-              <w:t xml:space="preserve">Ver sección 10: campos, reglas y ajustes pendientes</w:t>
+              <w:t xml:space="preserve">Ver sección 11: campos, reglas y ajustes pendientes</w:t>
             </w:r>
           </w:p>
         </w:tc>
@@ -1219,7 +3366,7 @@
         <w:pStyle w:val="Heading1"/>
       </w:pPr>
       <w:r>
-        <w:t xml:space="preserve">2. Resumen Ejecutivo</w:t>
+        <w:t xml:space="preserve">4. Resumen Ejecutivo</w:t>
       </w:r>
     </w:p>
     <w:p>
@@ -1802,7 +3949,7 @@
         <w:pStyle w:val="Heading1"/>
       </w:pPr>
       <w:r>
-        <w:t xml:space="preserve">3. Customer Journey</w:t>
+        <w:t xml:space="preserve">5. Customer Journey</w:t>
       </w:r>
     </w:p>
     <w:p>
@@ -2423,7 +4570,7 @@
         <w:pStyle w:val="Heading1"/>
       </w:pPr>
       <w:r>
-        <w:t xml:space="preserve">4. Etapas del Pipeline</w:t>
+        <w:t xml:space="preserve">6. Etapas del Pipeline</w:t>
       </w:r>
     </w:p>
     <w:tbl>
@@ -3037,7 +5184,7 @@
         <w:pStyle w:val="Heading1"/>
       </w:pPr>
       <w:r>
-        <w:t xml:space="preserve">5. Validación de mensajes y reglas garantizadas</w:t>
+        <w:t xml:space="preserve">7. Validación de mensajes y reglas garantizadas</w:t>
       </w:r>
     </w:p>
     <w:p>
@@ -3998,7 +6145,7 @@
         <w:pStyle w:val="Heading1"/>
       </w:pPr>
       <w:r>
-        <w:t xml:space="preserve">6. Cotización y precios</w:t>
+        <w:t xml:space="preserve">8. Cotización y precios</w:t>
       </w:r>
     </w:p>
     <w:p>
@@ -4585,7 +6732,7 @@
         <w:pStyle w:val="Heading1"/>
       </w:pPr>
       <w:r>
-        <w:t xml:space="preserve">7. Confirmación de reserva</w:t>
+        <w:t xml:space="preserve">9. Confirmación de reserva</w:t>
       </w:r>
     </w:p>
     <w:p>
@@ -5130,7 +7277,7 @@
         <w:pStyle w:val="Heading1"/>
       </w:pPr>
       <w:r>
-        <w:t xml:space="preserve">8. Mensaje inicial de bienvenida</w:t>
+        <w:t xml:space="preserve">10. Mensaje inicial de bienvenida</w:t>
       </w:r>
     </w:p>
     <w:p>
@@ -5225,7 +7372,7 @@
         <w:pStyle w:val="Heading1"/>
       </w:pPr>
       <w:r>
-        <w:t xml:space="preserve">9. Inventario de fincas (Google Sheet)</w:t>
+        <w:t xml:space="preserve">11. Inventario de fincas (Google Sheet)</w:t>
       </w:r>
     </w:p>
     <w:p>
@@ -6384,7 +8531,7 @@
         <w:pStyle w:val="Heading1"/>
       </w:pPr>
       <w:r>
-        <w:t xml:space="preserve">10. Aviso al equipo y paso al asesor</w:t>
+        <w:t xml:space="preserve">12. Aviso al equipo y paso al asesor</w:t>
       </w:r>
     </w:p>
     <w:p>
@@ -6406,7 +8553,7 @@
         <w:pStyle w:val="ListParagraph"/>
         <w:numPr>
           <w:ilvl w:val="0"/>
-          <w:numId w:val="3"/>
+          <w:numId w:val="8"/>
         </w:numPr>
         <w:spacing w:after="60"/>
       </w:pPr>
@@ -6425,7 +8572,7 @@
         <w:pStyle w:val="ListParagraph"/>
         <w:numPr>
           <w:ilvl w:val="0"/>
-          <w:numId w:val="3"/>
+          <w:numId w:val="8"/>
         </w:numPr>
         <w:spacing w:after="60"/>
       </w:pPr>
@@ -6444,7 +8591,7 @@
         <w:pStyle w:val="ListParagraph"/>
         <w:numPr>
           <w:ilvl w:val="0"/>
-          <w:numId w:val="3"/>
+          <w:numId w:val="8"/>
         </w:numPr>
         <w:spacing w:after="60"/>
       </w:pPr>
@@ -6463,7 +8610,7 @@
         <w:pStyle w:val="ListParagraph"/>
         <w:numPr>
           <w:ilvl w:val="0"/>
-          <w:numId w:val="3"/>
+          <w:numId w:val="8"/>
         </w:numPr>
         <w:spacing w:after="60"/>
       </w:pPr>
@@ -6487,7 +8634,7 @@
         <w:pStyle w:val="Heading1"/>
       </w:pPr>
       <w:r>
-        <w:t xml:space="preserve">11. Recordatorios automáticos (seguimientos)</w:t>
+        <w:t xml:space="preserve">13. Recordatorios automáticos (seguimientos)</w:t>
       </w:r>
     </w:p>
     <w:p>
@@ -6832,7 +8979,7 @@
         <w:pStyle w:val="Heading1"/>
       </w:pPr>
       <w:r>
-        <w:t xml:space="preserve">12. Panel de administración</w:t>
+        <w:t xml:space="preserve">14. Panel de administración</w:t>
       </w:r>
     </w:p>
     <w:tbl>
@@ -7321,7 +9468,7 @@
         <w:pStyle w:val="Heading1"/>
       </w:pPr>
       <w:r>
-        <w:t xml:space="preserve">13. Datos almacenados</w:t>
+        <w:t xml:space="preserve">15. Datos almacenados</w:t>
       </w:r>
     </w:p>
     <w:tbl>
@@ -7763,7 +9910,7 @@
         <w:pStyle w:val="Heading1"/>
       </w:pPr>
       <w:r>
-        <w:t xml:space="preserve">14. Zonas de cobertura</w:t>
+        <w:t xml:space="preserve">16. Zonas de cobertura</w:t>
       </w:r>
     </w:p>
     <w:p>
@@ -8182,7 +10329,7 @@
         <w:pStyle w:val="Heading1"/>
       </w:pPr>
       <w:r>
-        <w:t xml:space="preserve">15. Calidad y vigilancia</w:t>
+        <w:t xml:space="preserve">17. Calidad y vigilancia</w:t>
       </w:r>
     </w:p>
     <w:tbl>
@@ -8738,7 +10885,7 @@
         <w:pStyle w:val="Heading1"/>
       </w:pPr>
       <w:r>
-        <w:t xml:space="preserve">16. Recomendaciones y próximos pasos</w:t>
+        <w:t xml:space="preserve">18. Recomendaciones y próximos pasos</w:t>
       </w:r>
     </w:p>
     <w:tbl>
@@ -8813,7 +10960,7 @@
                 <w:sz w:val="20"/>
                 <w:szCs w:val="20"/>
               </w:rPr>
-              <w:t xml:space="preserve">Agregarlo esta semana (sección 1). Sin él el asistente se detiene al agotar la cuota gratuita.</w:t>
+              <w:t xml:space="preserve">Agregarlo esta semana (sección 2.1). Sin él el asistente se detiene al agotar la cuota gratuita.</w:t>
             </w:r>
           </w:p>
         </w:tc>
@@ -8935,7 +11082,7 @@
                 <w:sz w:val="20"/>
                 <w:szCs w:val="20"/>
               </w:rPr>
-              <w:t xml:space="preserve">Aplicar los ajustes de datos de la sección 9 y mantener fotos, precios y disponibilidad al día.</w:t>
+              <w:t xml:space="preserve">Aplicar los ajustes de datos de la sección 11 y mantener fotos, precios y disponibilidad al día.</w:t>
             </w:r>
           </w:p>
         </w:tc>
@@ -9388,6 +11535,138 @@
       </w:pPr>
     </w:lvl>
   </w:abstractNum>
+  <w:abstractNum w:abstractNumId="4" w15:restartNumberingAfterBreak="0">
+    <w:multiLevelType w:val="hybridMultilevel"/>
+    <w:lvl w:ilvl="0" w15:tentative="1">
+      <w:start w:val="1"/>
+      <w:numFmt w:val="decimal"/>
+      <w:lvlText w:val="%1."/>
+      <w:lvlJc w:val="left"/>
+      <w:pPr>
+        <w:ind w:left="540" w:hanging="300"/>
+      </w:pPr>
+    </w:lvl>
+  </w:abstractNum>
+  <w:abstractNum w:abstractNumId="5" w15:restartNumberingAfterBreak="0">
+    <w:multiLevelType w:val="hybridMultilevel"/>
+    <w:lvl w:ilvl="0" w15:tentative="1">
+      <w:start w:val="1"/>
+      <w:numFmt w:val="decimal"/>
+      <w:lvlText w:val="%1."/>
+      <w:lvlJc w:val="left"/>
+      <w:pPr>
+        <w:ind w:left="540" w:hanging="300"/>
+      </w:pPr>
+    </w:lvl>
+  </w:abstractNum>
+  <w:abstractNum w:abstractNumId="6" w15:restartNumberingAfterBreak="0">
+    <w:multiLevelType w:val="hybridMultilevel"/>
+    <w:lvl w:ilvl="0" w15:tentative="1">
+      <w:start w:val="1"/>
+      <w:numFmt w:val="decimal"/>
+      <w:lvlText w:val="%1."/>
+      <w:lvlJc w:val="left"/>
+      <w:pPr>
+        <w:ind w:left="540" w:hanging="300"/>
+      </w:pPr>
+    </w:lvl>
+  </w:abstractNum>
+  <w:abstractNum w:abstractNumId="7" w15:restartNumberingAfterBreak="0">
+    <w:multiLevelType w:val="hybridMultilevel"/>
+    <w:lvl w:ilvl="0" w15:tentative="1">
+      <w:start w:val="1"/>
+      <w:numFmt w:val="decimal"/>
+      <w:lvlText w:val="%1."/>
+      <w:lvlJc w:val="left"/>
+      <w:pPr>
+        <w:ind w:left="540" w:hanging="300"/>
+      </w:pPr>
+    </w:lvl>
+  </w:abstractNum>
+  <w:abstractNum w:abstractNumId="8" w15:restartNumberingAfterBreak="0">
+    <w:multiLevelType w:val="hybridMultilevel"/>
+    <w:lvl w:ilvl="0" w15:tentative="1">
+      <w:start w:val="1"/>
+      <w:numFmt w:val="decimal"/>
+      <w:lvlText w:val="%1."/>
+      <w:lvlJc w:val="left"/>
+      <w:pPr>
+        <w:ind w:left="540" w:hanging="300"/>
+      </w:pPr>
+    </w:lvl>
+  </w:abstractNum>
+  <w:abstractNum w:abstractNumId="9" w15:restartNumberingAfterBreak="0">
+    <w:multiLevelType w:val="hybridMultilevel"/>
+    <w:lvl w:ilvl="0" w15:tentative="1">
+      <w:start w:val="1"/>
+      <w:numFmt w:val="decimal"/>
+      <w:lvlText w:val="%1."/>
+      <w:lvlJc w:val="left"/>
+      <w:pPr>
+        <w:ind w:left="540" w:hanging="300"/>
+      </w:pPr>
+    </w:lvl>
+  </w:abstractNum>
+  <w:abstractNum w:abstractNumId="10" w15:restartNumberingAfterBreak="0">
+    <w:multiLevelType w:val="hybridMultilevel"/>
+    <w:lvl w:ilvl="0" w15:tentative="1">
+      <w:start w:val="1"/>
+      <w:numFmt w:val="decimal"/>
+      <w:lvlText w:val="%1."/>
+      <w:lvlJc w:val="left"/>
+      <w:pPr>
+        <w:ind w:left="540" w:hanging="300"/>
+      </w:pPr>
+    </w:lvl>
+  </w:abstractNum>
+  <w:abstractNum w:abstractNumId="11" w15:restartNumberingAfterBreak="0">
+    <w:multiLevelType w:val="hybridMultilevel"/>
+    <w:lvl w:ilvl="0" w15:tentative="1">
+      <w:start w:val="1"/>
+      <w:numFmt w:val="decimal"/>
+      <w:lvlText w:val="%1."/>
+      <w:lvlJc w:val="left"/>
+      <w:pPr>
+        <w:ind w:left="540" w:hanging="300"/>
+      </w:pPr>
+    </w:lvl>
+  </w:abstractNum>
+  <w:abstractNum w:abstractNumId="12" w15:restartNumberingAfterBreak="0">
+    <w:multiLevelType w:val="hybridMultilevel"/>
+    <w:lvl w:ilvl="0" w15:tentative="1">
+      <w:start w:val="1"/>
+      <w:numFmt w:val="decimal"/>
+      <w:lvlText w:val="%1."/>
+      <w:lvlJc w:val="left"/>
+      <w:pPr>
+        <w:ind w:left="540" w:hanging="300"/>
+      </w:pPr>
+    </w:lvl>
+  </w:abstractNum>
+  <w:abstractNum w:abstractNumId="13" w15:restartNumberingAfterBreak="0">
+    <w:multiLevelType w:val="hybridMultilevel"/>
+    <w:lvl w:ilvl="0" w15:tentative="1">
+      <w:start w:val="1"/>
+      <w:numFmt w:val="decimal"/>
+      <w:lvlText w:val="%1."/>
+      <w:lvlJc w:val="left"/>
+      <w:pPr>
+        <w:ind w:left="540" w:hanging="300"/>
+      </w:pPr>
+    </w:lvl>
+  </w:abstractNum>
+  <w:abstractNum w:abstractNumId="14" w15:restartNumberingAfterBreak="0">
+    <w:multiLevelType w:val="hybridMultilevel"/>
+    <w:lvl w:ilvl="0" w15:tentative="1">
+      <w:start w:val="1"/>
+      <w:numFmt w:val="decimal"/>
+      <w:lvlText w:val="%1."/>
+      <w:lvlJc w:val="left"/>
+      <w:pPr>
+        <w:ind w:left="540" w:hanging="300"/>
+      </w:pPr>
+    </w:lvl>
+  </w:abstractNum>
   <w:num w:numId="1">
     <w:abstractNumId w:val="1"/>
     <w:lvlOverride w:ilvl="0">
@@ -9395,12 +11674,42 @@
     </w:lvlOverride>
   </w:num>
   <w:num w:numId="2">
-    <w:abstractNumId w:val="3"/>
+    <w:abstractNumId w:val="4"/>
     <w:lvlOverride w:ilvl="0">
       <w:startOverride w:val="1"/>
     </w:lvlOverride>
   </w:num>
   <w:num w:numId="3">
+    <w:abstractNumId w:val="5"/>
+    <w:lvlOverride w:ilvl="0">
+      <w:startOverride w:val="1"/>
+    </w:lvlOverride>
+  </w:num>
+  <w:num w:numId="4">
+    <w:abstractNumId w:val="6"/>
+    <w:lvlOverride w:ilvl="0">
+      <w:startOverride w:val="1"/>
+    </w:lvlOverride>
+  </w:num>
+  <w:num w:numId="5">
+    <w:abstractNumId w:val="7"/>
+    <w:lvlOverride w:ilvl="0">
+      <w:startOverride w:val="1"/>
+    </w:lvlOverride>
+  </w:num>
+  <w:num w:numId="6">
+    <w:abstractNumId w:val="8"/>
+    <w:lvlOverride w:ilvl="0">
+      <w:startOverride w:val="1"/>
+    </w:lvlOverride>
+  </w:num>
+  <w:num w:numId="7">
+    <w:abstractNumId w:val="9"/>
+    <w:lvlOverride w:ilvl="0">
+      <w:startOverride w:val="1"/>
+    </w:lvlOverride>
+  </w:num>
+  <w:num w:numId="8">
     <w:abstractNumId w:val="2"/>
     <w:lvlOverride w:ilvl="0">
       <w:startOverride w:val="1"/>

</xml_diff>

<commit_message>
docs: Entrega v2 incluye Kapso en la tabla de cuentas
</commit_message>
<xml_diff>
--- a/docs/Entrega_DePaseoEnFincas.docx
+++ b/docs/Entrega_DePaseoEnFincas.docx
@@ -1009,6 +1009,148 @@
                 <w:szCs w:val="20"/>
               </w:rPr>
               <w:t xml:space="preserve">Aprox. US$18/mes (plan CPX31)</w:t>
+            </w:r>
+          </w:p>
+        </w:tc>
+      </w:tr>
+      <w:tr>
+        <w:tc>
+          <w:tcPr>
+            <w:tcW w:type="dxa" w:w="1900"/>
+            <w:tcBorders>
+              <w:top w:val="single" w:color="E0E0E0" w:sz="1"/>
+              <w:left w:val="single" w:color="E0E0E0" w:sz="1"/>
+              <w:bottom w:val="single" w:color="E0E0E0" w:sz="1"/>
+              <w:right w:val="single" w:color="E0E0E0" w:sz="1"/>
+            </w:tcBorders>
+            <w:tcMar>
+              <w:top w:type="dxa" w:w="80"/>
+              <w:left w:type="dxa" w:w="120"/>
+              <w:bottom w:type="dxa" w:w="80"/>
+              <w:right w:type="dxa" w:w="120"/>
+            </w:tcMar>
+          </w:tcPr>
+          <w:p>
+            <w:r>
+              <w:rPr>
+                <w:rFonts w:ascii="Arial" w:cs="Arial" w:eastAsia="Arial" w:hAnsi="Arial"/>
+                <w:color w:val="212121"/>
+                <w:sz w:val="20"/>
+                <w:szCs w:val="20"/>
+              </w:rPr>
+              <w:t xml:space="preserve">Kapso (plataforma del número de WhatsApp)</w:t>
+            </w:r>
+          </w:p>
+        </w:tc>
+        <w:tc>
+          <w:tcPr>
+            <w:tcW w:type="dxa" w:w="2100"/>
+            <w:tcBorders>
+              <w:top w:val="single" w:color="E0E0E0" w:sz="1"/>
+              <w:left w:val="single" w:color="E0E0E0" w:sz="1"/>
+              <w:bottom w:val="single" w:color="E0E0E0" w:sz="1"/>
+              <w:right w:val="single" w:color="E0E0E0" w:sz="1"/>
+            </w:tcBorders>
+            <w:tcMar>
+              <w:top w:type="dxa" w:w="80"/>
+              <w:left w:type="dxa" w:w="120"/>
+              <w:bottom w:type="dxa" w:w="80"/>
+              <w:right w:type="dxa" w:w="120"/>
+            </w:tcMar>
+          </w:tcPr>
+          <w:p>
+            <w:r>
+              <w:rPr>
+                <w:rFonts w:ascii="Arial" w:cs="Arial" w:eastAsia="Arial" w:hAnsi="Arial"/>
+                <w:color w:val="212121"/>
+                <w:sz w:val="20"/>
+                <w:szCs w:val="20"/>
+              </w:rPr>
+              <w:t xml:space="preserve">A través de Kapso (proveedor tecnológico de Meta) se registró la línea +1 201-701-8810</w:t>
+            </w:r>
+          </w:p>
+        </w:tc>
+        <w:tc>
+          <w:tcPr>
+            <w:tcW w:type="dxa" w:w="1700"/>
+            <w:tcBorders>
+              <w:top w:val="single" w:color="E0E0E0" w:sz="1"/>
+              <w:left w:val="single" w:color="E0E0E0" w:sz="1"/>
+              <w:bottom w:val="single" w:color="E0E0E0" w:sz="1"/>
+              <w:right w:val="single" w:color="E0E0E0" w:sz="1"/>
+            </w:tcBorders>
+            <w:tcMar>
+              <w:top w:type="dxa" w:w="80"/>
+              <w:left w:type="dxa" w:w="120"/>
+              <w:bottom w:type="dxa" w:w="80"/>
+              <w:right w:type="dxa" w:w="120"/>
+            </w:tcMar>
+          </w:tcPr>
+          <w:p>
+            <w:r>
+              <w:rPr>
+                <w:rFonts w:ascii="Arial" w:cs="Arial" w:eastAsia="Arial" w:hAnsi="Arial"/>
+                <w:color w:val="212121"/>
+                <w:sz w:val="20"/>
+                <w:szCs w:val="20"/>
+              </w:rPr>
+              <w:t xml:space="preserve">Cuenta de Kapso de raaamp</w:t>
+            </w:r>
+          </w:p>
+        </w:tc>
+        <w:tc>
+          <w:tcPr>
+            <w:tcW w:type="dxa" w:w="2560"/>
+            <w:tcBorders>
+              <w:top w:val="single" w:color="E0E0E0" w:sz="1"/>
+              <w:left w:val="single" w:color="E0E0E0" w:sz="1"/>
+              <w:bottom w:val="single" w:color="E0E0E0" w:sz="1"/>
+              <w:right w:val="single" w:color="E0E0E0" w:sz="1"/>
+            </w:tcBorders>
+            <w:tcMar>
+              <w:top w:type="dxa" w:w="80"/>
+              <w:left w:type="dxa" w:w="120"/>
+              <w:bottom w:type="dxa" w:w="80"/>
+              <w:right w:type="dxa" w:w="120"/>
+            </w:tcMar>
+          </w:tcPr>
+          <w:p>
+            <w:r>
+              <w:rPr>
+                <w:rFonts w:ascii="Arial" w:cs="Arial" w:eastAsia="Arial" w:hAnsi="Arial"/>
+                <w:color w:val="212121"/>
+                <w:sz w:val="20"/>
+                <w:szCs w:val="20"/>
+              </w:rPr>
+              <w:t xml:space="preserve">raaamp revisa el plan en app.kapso.ai; si tiene costo, se factura o se traslada la cuenta (ver Guía de cuentas y métodos de pago)</w:t>
+            </w:r>
+          </w:p>
+        </w:tc>
+        <w:tc>
+          <w:tcPr>
+            <w:tcW w:type="dxa" w:w="1100"/>
+            <w:tcBorders>
+              <w:top w:val="single" w:color="E0E0E0" w:sz="1"/>
+              <w:left w:val="single" w:color="E0E0E0" w:sz="1"/>
+              <w:bottom w:val="single" w:color="E0E0E0" w:sz="1"/>
+              <w:right w:val="single" w:color="E0E0E0" w:sz="1"/>
+            </w:tcBorders>
+            <w:tcMar>
+              <w:top w:type="dxa" w:w="80"/>
+              <w:left w:type="dxa" w:w="120"/>
+              <w:bottom w:type="dxa" w:w="80"/>
+              <w:right w:type="dxa" w:w="120"/>
+            </w:tcMar>
+          </w:tcPr>
+          <w:p>
+            <w:r>
+              <w:rPr>
+                <w:rFonts w:ascii="Arial" w:cs="Arial" w:eastAsia="Arial" w:hAnsi="Arial"/>
+                <w:color w:val="212121"/>
+                <w:sz w:val="20"/>
+                <w:szCs w:val="20"/>
+              </w:rPr>
+              <w:t xml:space="preserve">Según plan (verificar)</w:t>
             </w:r>
           </w:p>
         </w:tc>

</xml_diff>

<commit_message>
docs: Kapso se accede con la cuenta de Google del cliente
</commit_message>
<xml_diff>
--- a/docs/Entrega_DePaseoEnFincas.docx
+++ b/docs/Entrega_DePaseoEnFincas.docx
@@ -1094,7 +1094,7 @@
                 <w:sz w:val="20"/>
                 <w:szCs w:val="20"/>
               </w:rPr>
-              <w:t xml:space="preserve">Cuenta de Kapso de raaamp</w:t>
+              <w:t xml:space="preserve">Cuenta de Kapso con la cuenta de Google de De Paseo en Fincas</w:t>
             </w:r>
           </w:p>
         </w:tc>
@@ -1122,7 +1122,7 @@
                 <w:sz w:val="20"/>
                 <w:szCs w:val="20"/>
               </w:rPr>
-              <w:t xml:space="preserve">raaamp revisa el plan en app.kapso.ai; si tiene costo, se factura o se traslada la cuenta (ver Guía de cuentas y métodos de pago)</w:t>
+              <w:t xml:space="preserve">Nada por ahora; se entra en app.kapso.ai con Continuar con Google</w:t>
             </w:r>
           </w:p>
         </w:tc>
@@ -1150,7 +1150,7 @@
                 <w:sz w:val="20"/>
                 <w:szCs w:val="20"/>
               </w:rPr>
-              <w:t xml:space="preserve">Según plan (verificar)</w:t>
+              <w:t xml:space="preserve">Incluido</w:t>
             </w:r>
           </w:p>
         </w:tc>

</xml_diff>